<commit_message>
Complete funtion 12 - 14
</commit_message>
<xml_diff>
--- a/documents/New Microsoft Word Document.docx
+++ b/documents/New Microsoft Word Document.docx
@@ -1895,13 +1895,7 @@
         <w:rPr>
           <w:rFonts w:ascii="Times New Roman" w:hAnsi="Times New Roman" w:cs="Times New Roman"/>
         </w:rPr>
-        <w:t xml:space="preserve">ucUser: </w:t>
-      </w:r>
-      <w:r>
-        <w:rPr>
-          <w:rFonts w:ascii="Times New Roman" w:hAnsi="Times New Roman" w:cs="Times New Roman"/>
-        </w:rPr>
-        <w:t>Tổng guest, host, active, mới theo tháng.</w:t>
+        <w:t>ucUser: Tổng guest, host, active, mới theo tháng.</w:t>
       </w:r>
     </w:p>
     <w:p>
@@ -4841,6 +4835,7 @@
         <w:tc>
           <w:tcPr>
             <w:tcW w:w="248" w:type="pct"/>
+            <w:shd w:val="clear" w:color="auto" w:fill="FFFF00"/>
             <w:hideMark/>
           </w:tcPr>
           <w:p>
@@ -4861,6 +4856,7 @@
         <w:tc>
           <w:tcPr>
             <w:tcW w:w="1661" w:type="pct"/>
+            <w:shd w:val="clear" w:color="auto" w:fill="FFFF00"/>
             <w:hideMark/>
           </w:tcPr>
           <w:p>
@@ -4881,6 +4877,7 @@
         <w:tc>
           <w:tcPr>
             <w:tcW w:w="617" w:type="pct"/>
+            <w:shd w:val="clear" w:color="auto" w:fill="FFFF00"/>
             <w:hideMark/>
           </w:tcPr>
           <w:p>
@@ -4901,6 +4898,7 @@
         <w:tc>
           <w:tcPr>
             <w:tcW w:w="2474" w:type="pct"/>
+            <w:shd w:val="clear" w:color="auto" w:fill="FFFF00"/>
             <w:hideMark/>
           </w:tcPr>
           <w:p>
@@ -8275,6 +8273,7 @@
   <w:style w:type="character" w:default="1" w:styleId="DefaultParagraphFont">
     <w:name w:val="Default Paragraph Font"/>
     <w:uiPriority w:val="1"/>
+    <w:semiHidden/>
     <w:unhideWhenUsed/>
   </w:style>
   <w:style w:type="table" w:default="1" w:styleId="TableNormal">

</xml_diff>

<commit_message>
new feature My Profile - Host
</commit_message>
<xml_diff>
--- a/documents/New Microsoft Word Document.docx
+++ b/documents/New Microsoft Word Document.docx
@@ -3652,7 +3652,7 @@
         </w:tc>
         <w:tc>
           <w:tcPr>
-            <w:tcW w:w="1661" w:type="pct"/>
+            <w:tcW w:w="1937" w:type="pct"/>
             <w:hideMark/>
           </w:tcPr>
           <w:p>
@@ -3672,7 +3672,7 @@
         </w:tc>
         <w:tc>
           <w:tcPr>
-            <w:tcW w:w="617" w:type="pct"/>
+            <w:tcW w:w="441" w:type="pct"/>
             <w:hideMark/>
           </w:tcPr>
           <w:p>
@@ -3692,7 +3692,7 @@
         </w:tc>
         <w:tc>
           <w:tcPr>
-            <w:tcW w:w="2474" w:type="pct"/>
+            <w:tcW w:w="2374" w:type="pct"/>
             <w:hideMark/>
           </w:tcPr>
           <w:p>
@@ -3735,7 +3735,7 @@
         </w:tc>
         <w:tc>
           <w:tcPr>
-            <w:tcW w:w="1661" w:type="pct"/>
+            <w:tcW w:w="1937" w:type="pct"/>
             <w:shd w:val="clear" w:color="auto" w:fill="FFFF00"/>
             <w:hideMark/>
           </w:tcPr>
@@ -3756,7 +3756,7 @@
         </w:tc>
         <w:tc>
           <w:tcPr>
-            <w:tcW w:w="617" w:type="pct"/>
+            <w:tcW w:w="441" w:type="pct"/>
             <w:shd w:val="clear" w:color="auto" w:fill="FFFF00"/>
             <w:hideMark/>
           </w:tcPr>
@@ -3777,7 +3777,7 @@
         </w:tc>
         <w:tc>
           <w:tcPr>
-            <w:tcW w:w="2474" w:type="pct"/>
+            <w:tcW w:w="2374" w:type="pct"/>
             <w:shd w:val="clear" w:color="auto" w:fill="FFFF00"/>
             <w:hideMark/>
           </w:tcPr>
@@ -3828,7 +3828,7 @@
         </w:tc>
         <w:tc>
           <w:tcPr>
-            <w:tcW w:w="1661" w:type="pct"/>
+            <w:tcW w:w="1937" w:type="pct"/>
             <w:shd w:val="clear" w:color="auto" w:fill="FFFF00"/>
             <w:hideMark/>
           </w:tcPr>
@@ -3849,7 +3849,7 @@
         </w:tc>
         <w:tc>
           <w:tcPr>
-            <w:tcW w:w="617" w:type="pct"/>
+            <w:tcW w:w="441" w:type="pct"/>
             <w:shd w:val="clear" w:color="auto" w:fill="FFFF00"/>
             <w:hideMark/>
           </w:tcPr>
@@ -3870,7 +3870,7 @@
         </w:tc>
         <w:tc>
           <w:tcPr>
-            <w:tcW w:w="2474" w:type="pct"/>
+            <w:tcW w:w="2374" w:type="pct"/>
             <w:shd w:val="clear" w:color="auto" w:fill="FFFF00"/>
             <w:hideMark/>
           </w:tcPr>
@@ -3914,7 +3914,7 @@
         </w:tc>
         <w:tc>
           <w:tcPr>
-            <w:tcW w:w="1661" w:type="pct"/>
+            <w:tcW w:w="1937" w:type="pct"/>
             <w:shd w:val="clear" w:color="auto" w:fill="FFFF00"/>
             <w:hideMark/>
           </w:tcPr>
@@ -3935,7 +3935,7 @@
         </w:tc>
         <w:tc>
           <w:tcPr>
-            <w:tcW w:w="617" w:type="pct"/>
+            <w:tcW w:w="441" w:type="pct"/>
             <w:shd w:val="clear" w:color="auto" w:fill="FFFF00"/>
             <w:hideMark/>
           </w:tcPr>
@@ -3956,7 +3956,7 @@
         </w:tc>
         <w:tc>
           <w:tcPr>
-            <w:tcW w:w="2474" w:type="pct"/>
+            <w:tcW w:w="2374" w:type="pct"/>
             <w:shd w:val="clear" w:color="auto" w:fill="FFFF00"/>
             <w:hideMark/>
           </w:tcPr>
@@ -4000,7 +4000,7 @@
         </w:tc>
         <w:tc>
           <w:tcPr>
-            <w:tcW w:w="1661" w:type="pct"/>
+            <w:tcW w:w="1937" w:type="pct"/>
             <w:shd w:val="clear" w:color="auto" w:fill="FFFF00"/>
             <w:hideMark/>
           </w:tcPr>
@@ -4021,7 +4021,7 @@
         </w:tc>
         <w:tc>
           <w:tcPr>
-            <w:tcW w:w="617" w:type="pct"/>
+            <w:tcW w:w="441" w:type="pct"/>
             <w:shd w:val="clear" w:color="auto" w:fill="FFFF00"/>
             <w:hideMark/>
           </w:tcPr>
@@ -4042,7 +4042,7 @@
         </w:tc>
         <w:tc>
           <w:tcPr>
-            <w:tcW w:w="2474" w:type="pct"/>
+            <w:tcW w:w="2374" w:type="pct"/>
             <w:shd w:val="clear" w:color="auto" w:fill="FFFF00"/>
             <w:hideMark/>
           </w:tcPr>
@@ -4086,7 +4086,7 @@
         </w:tc>
         <w:tc>
           <w:tcPr>
-            <w:tcW w:w="1661" w:type="pct"/>
+            <w:tcW w:w="1937" w:type="pct"/>
             <w:shd w:val="clear" w:color="auto" w:fill="FFFF00"/>
             <w:hideMark/>
           </w:tcPr>
@@ -4107,7 +4107,7 @@
         </w:tc>
         <w:tc>
           <w:tcPr>
-            <w:tcW w:w="617" w:type="pct"/>
+            <w:tcW w:w="441" w:type="pct"/>
             <w:shd w:val="clear" w:color="auto" w:fill="FFFF00"/>
             <w:hideMark/>
           </w:tcPr>
@@ -4128,7 +4128,7 @@
         </w:tc>
         <w:tc>
           <w:tcPr>
-            <w:tcW w:w="2474" w:type="pct"/>
+            <w:tcW w:w="2374" w:type="pct"/>
             <w:shd w:val="clear" w:color="auto" w:fill="FFFF00"/>
             <w:hideMark/>
           </w:tcPr>
@@ -4171,7 +4171,7 @@
         </w:tc>
         <w:tc>
           <w:tcPr>
-            <w:tcW w:w="1661" w:type="pct"/>
+            <w:tcW w:w="1937" w:type="pct"/>
             <w:hideMark/>
           </w:tcPr>
           <w:p>
@@ -4191,7 +4191,7 @@
         </w:tc>
         <w:tc>
           <w:tcPr>
-            <w:tcW w:w="617" w:type="pct"/>
+            <w:tcW w:w="441" w:type="pct"/>
             <w:hideMark/>
           </w:tcPr>
           <w:p>
@@ -4211,7 +4211,7 @@
         </w:tc>
         <w:tc>
           <w:tcPr>
-            <w:tcW w:w="2474" w:type="pct"/>
+            <w:tcW w:w="2374" w:type="pct"/>
             <w:hideMark/>
           </w:tcPr>
           <w:p>
@@ -4253,7 +4253,7 @@
         </w:tc>
         <w:tc>
           <w:tcPr>
-            <w:tcW w:w="1661" w:type="pct"/>
+            <w:tcW w:w="1937" w:type="pct"/>
             <w:hideMark/>
           </w:tcPr>
           <w:p>
@@ -4273,7 +4273,7 @@
         </w:tc>
         <w:tc>
           <w:tcPr>
-            <w:tcW w:w="617" w:type="pct"/>
+            <w:tcW w:w="441" w:type="pct"/>
             <w:hideMark/>
           </w:tcPr>
           <w:p>
@@ -4293,7 +4293,7 @@
         </w:tc>
         <w:tc>
           <w:tcPr>
-            <w:tcW w:w="2474" w:type="pct"/>
+            <w:tcW w:w="2374" w:type="pct"/>
             <w:hideMark/>
           </w:tcPr>
           <w:p>
@@ -4336,7 +4336,7 @@
         </w:tc>
         <w:tc>
           <w:tcPr>
-            <w:tcW w:w="1661" w:type="pct"/>
+            <w:tcW w:w="1937" w:type="pct"/>
             <w:shd w:val="clear" w:color="auto" w:fill="FFFF00"/>
             <w:hideMark/>
           </w:tcPr>
@@ -4357,7 +4357,7 @@
         </w:tc>
         <w:tc>
           <w:tcPr>
-            <w:tcW w:w="617" w:type="pct"/>
+            <w:tcW w:w="441" w:type="pct"/>
             <w:shd w:val="clear" w:color="auto" w:fill="FFFF00"/>
             <w:hideMark/>
           </w:tcPr>
@@ -4378,7 +4378,7 @@
         </w:tc>
         <w:tc>
           <w:tcPr>
-            <w:tcW w:w="2474" w:type="pct"/>
+            <w:tcW w:w="2374" w:type="pct"/>
             <w:shd w:val="clear" w:color="auto" w:fill="FFFF00"/>
             <w:hideMark/>
           </w:tcPr>
@@ -4435,7 +4435,7 @@
         </w:tc>
         <w:tc>
           <w:tcPr>
-            <w:tcW w:w="1661" w:type="pct"/>
+            <w:tcW w:w="1937" w:type="pct"/>
             <w:hideMark/>
           </w:tcPr>
           <w:p>
@@ -4455,7 +4455,7 @@
         </w:tc>
         <w:tc>
           <w:tcPr>
-            <w:tcW w:w="617" w:type="pct"/>
+            <w:tcW w:w="441" w:type="pct"/>
             <w:hideMark/>
           </w:tcPr>
           <w:p>
@@ -4475,7 +4475,7 @@
         </w:tc>
         <w:tc>
           <w:tcPr>
-            <w:tcW w:w="2474" w:type="pct"/>
+            <w:tcW w:w="2374" w:type="pct"/>
             <w:hideMark/>
           </w:tcPr>
           <w:p>
@@ -4517,7 +4517,7 @@
         </w:tc>
         <w:tc>
           <w:tcPr>
-            <w:tcW w:w="1661" w:type="pct"/>
+            <w:tcW w:w="1937" w:type="pct"/>
             <w:hideMark/>
           </w:tcPr>
           <w:p>
@@ -4537,7 +4537,7 @@
         </w:tc>
         <w:tc>
           <w:tcPr>
-            <w:tcW w:w="617" w:type="pct"/>
+            <w:tcW w:w="441" w:type="pct"/>
             <w:hideMark/>
           </w:tcPr>
           <w:p>
@@ -4557,7 +4557,7 @@
         </w:tc>
         <w:tc>
           <w:tcPr>
-            <w:tcW w:w="2474" w:type="pct"/>
+            <w:tcW w:w="2374" w:type="pct"/>
             <w:hideMark/>
           </w:tcPr>
           <w:p>
@@ -4600,7 +4600,7 @@
         </w:tc>
         <w:tc>
           <w:tcPr>
-            <w:tcW w:w="1661" w:type="pct"/>
+            <w:tcW w:w="1937" w:type="pct"/>
             <w:hideMark/>
           </w:tcPr>
           <w:p>
@@ -4620,7 +4620,7 @@
         </w:tc>
         <w:tc>
           <w:tcPr>
-            <w:tcW w:w="617" w:type="pct"/>
+            <w:tcW w:w="441" w:type="pct"/>
             <w:hideMark/>
           </w:tcPr>
           <w:p>
@@ -4640,7 +4640,7 @@
         </w:tc>
         <w:tc>
           <w:tcPr>
-            <w:tcW w:w="2474" w:type="pct"/>
+            <w:tcW w:w="2374" w:type="pct"/>
             <w:hideMark/>
           </w:tcPr>
           <w:p>
@@ -4683,7 +4683,7 @@
         </w:tc>
         <w:tc>
           <w:tcPr>
-            <w:tcW w:w="1661" w:type="pct"/>
+            <w:tcW w:w="1937" w:type="pct"/>
             <w:shd w:val="clear" w:color="auto" w:fill="FFFF00"/>
             <w:hideMark/>
           </w:tcPr>
@@ -4704,7 +4704,7 @@
         </w:tc>
         <w:tc>
           <w:tcPr>
-            <w:tcW w:w="617" w:type="pct"/>
+            <w:tcW w:w="441" w:type="pct"/>
             <w:shd w:val="clear" w:color="auto" w:fill="FFFF00"/>
             <w:hideMark/>
           </w:tcPr>
@@ -4725,7 +4725,7 @@
         </w:tc>
         <w:tc>
           <w:tcPr>
-            <w:tcW w:w="2474" w:type="pct"/>
+            <w:tcW w:w="2374" w:type="pct"/>
             <w:shd w:val="clear" w:color="auto" w:fill="FFFF00"/>
             <w:hideMark/>
           </w:tcPr>
@@ -4769,7 +4769,7 @@
         </w:tc>
         <w:tc>
           <w:tcPr>
-            <w:tcW w:w="1661" w:type="pct"/>
+            <w:tcW w:w="1937" w:type="pct"/>
             <w:shd w:val="clear" w:color="auto" w:fill="FFFF00"/>
             <w:hideMark/>
           </w:tcPr>
@@ -4790,7 +4790,7 @@
         </w:tc>
         <w:tc>
           <w:tcPr>
-            <w:tcW w:w="617" w:type="pct"/>
+            <w:tcW w:w="441" w:type="pct"/>
             <w:shd w:val="clear" w:color="auto" w:fill="FFFF00"/>
             <w:hideMark/>
           </w:tcPr>
@@ -4811,7 +4811,7 @@
         </w:tc>
         <w:tc>
           <w:tcPr>
-            <w:tcW w:w="2474" w:type="pct"/>
+            <w:tcW w:w="2374" w:type="pct"/>
             <w:shd w:val="clear" w:color="auto" w:fill="FFFF00"/>
             <w:hideMark/>
           </w:tcPr>
@@ -4855,7 +4855,7 @@
         </w:tc>
         <w:tc>
           <w:tcPr>
-            <w:tcW w:w="1661" w:type="pct"/>
+            <w:tcW w:w="1937" w:type="pct"/>
             <w:shd w:val="clear" w:color="auto" w:fill="FFFF00"/>
             <w:hideMark/>
           </w:tcPr>
@@ -4876,7 +4876,7 @@
         </w:tc>
         <w:tc>
           <w:tcPr>
-            <w:tcW w:w="617" w:type="pct"/>
+            <w:tcW w:w="441" w:type="pct"/>
             <w:shd w:val="clear" w:color="auto" w:fill="FFFF00"/>
             <w:hideMark/>
           </w:tcPr>
@@ -4897,7 +4897,7 @@
         </w:tc>
         <w:tc>
           <w:tcPr>
-            <w:tcW w:w="2474" w:type="pct"/>
+            <w:tcW w:w="2374" w:type="pct"/>
             <w:shd w:val="clear" w:color="auto" w:fill="FFFF00"/>
             <w:hideMark/>
           </w:tcPr>
@@ -4940,7 +4940,7 @@
         </w:tc>
         <w:tc>
           <w:tcPr>
-            <w:tcW w:w="1661" w:type="pct"/>
+            <w:tcW w:w="1937" w:type="pct"/>
             <w:hideMark/>
           </w:tcPr>
           <w:p>
@@ -4960,7 +4960,7 @@
         </w:tc>
         <w:tc>
           <w:tcPr>
-            <w:tcW w:w="617" w:type="pct"/>
+            <w:tcW w:w="441" w:type="pct"/>
             <w:hideMark/>
           </w:tcPr>
           <w:p>
@@ -4980,7 +4980,7 @@
         </w:tc>
         <w:tc>
           <w:tcPr>
-            <w:tcW w:w="2474" w:type="pct"/>
+            <w:tcW w:w="2374" w:type="pct"/>
             <w:hideMark/>
           </w:tcPr>
           <w:p>
@@ -5022,7 +5022,7 @@
         </w:tc>
         <w:tc>
           <w:tcPr>
-            <w:tcW w:w="1661" w:type="pct"/>
+            <w:tcW w:w="1937" w:type="pct"/>
             <w:hideMark/>
           </w:tcPr>
           <w:p>
@@ -5042,7 +5042,7 @@
         </w:tc>
         <w:tc>
           <w:tcPr>
-            <w:tcW w:w="617" w:type="pct"/>
+            <w:tcW w:w="441" w:type="pct"/>
             <w:hideMark/>
           </w:tcPr>
           <w:p>
@@ -5062,7 +5062,7 @@
         </w:tc>
         <w:tc>
           <w:tcPr>
-            <w:tcW w:w="2474" w:type="pct"/>
+            <w:tcW w:w="2374" w:type="pct"/>
             <w:hideMark/>
           </w:tcPr>
           <w:p>
@@ -5104,7 +5104,7 @@
         </w:tc>
         <w:tc>
           <w:tcPr>
-            <w:tcW w:w="1661" w:type="pct"/>
+            <w:tcW w:w="1937" w:type="pct"/>
             <w:hideMark/>
           </w:tcPr>
           <w:p>
@@ -5124,7 +5124,7 @@
         </w:tc>
         <w:tc>
           <w:tcPr>
-            <w:tcW w:w="617" w:type="pct"/>
+            <w:tcW w:w="441" w:type="pct"/>
             <w:hideMark/>
           </w:tcPr>
           <w:p>
@@ -5144,7 +5144,7 @@
         </w:tc>
         <w:tc>
           <w:tcPr>
-            <w:tcW w:w="2474" w:type="pct"/>
+            <w:tcW w:w="2374" w:type="pct"/>
             <w:hideMark/>
           </w:tcPr>
           <w:p>
@@ -5193,7 +5193,7 @@
         </w:tc>
         <w:tc>
           <w:tcPr>
-            <w:tcW w:w="1661" w:type="pct"/>
+            <w:tcW w:w="1937" w:type="pct"/>
             <w:hideMark/>
           </w:tcPr>
           <w:p>
@@ -5213,7 +5213,7 @@
         </w:tc>
         <w:tc>
           <w:tcPr>
-            <w:tcW w:w="617" w:type="pct"/>
+            <w:tcW w:w="441" w:type="pct"/>
             <w:hideMark/>
           </w:tcPr>
           <w:p>
@@ -5233,7 +5233,7 @@
         </w:tc>
         <w:tc>
           <w:tcPr>
-            <w:tcW w:w="2474" w:type="pct"/>
+            <w:tcW w:w="2374" w:type="pct"/>
             <w:hideMark/>
           </w:tcPr>
           <w:p>
@@ -5275,7 +5275,7 @@
         </w:tc>
         <w:tc>
           <w:tcPr>
-            <w:tcW w:w="1661" w:type="pct"/>
+            <w:tcW w:w="1937" w:type="pct"/>
             <w:hideMark/>
           </w:tcPr>
           <w:p>
@@ -5295,7 +5295,7 @@
         </w:tc>
         <w:tc>
           <w:tcPr>
-            <w:tcW w:w="617" w:type="pct"/>
+            <w:tcW w:w="441" w:type="pct"/>
             <w:hideMark/>
           </w:tcPr>
           <w:p>
@@ -5315,7 +5315,7 @@
         </w:tc>
         <w:tc>
           <w:tcPr>
-            <w:tcW w:w="2474" w:type="pct"/>
+            <w:tcW w:w="2374" w:type="pct"/>
             <w:hideMark/>
           </w:tcPr>
           <w:p>
@@ -5358,7 +5358,7 @@
         </w:tc>
         <w:tc>
           <w:tcPr>
-            <w:tcW w:w="1661" w:type="pct"/>
+            <w:tcW w:w="1937" w:type="pct"/>
             <w:hideMark/>
           </w:tcPr>
           <w:p>
@@ -5378,7 +5378,7 @@
         </w:tc>
         <w:tc>
           <w:tcPr>
-            <w:tcW w:w="617" w:type="pct"/>
+            <w:tcW w:w="441" w:type="pct"/>
             <w:hideMark/>
           </w:tcPr>
           <w:p>
@@ -5398,7 +5398,7 @@
         </w:tc>
         <w:tc>
           <w:tcPr>
-            <w:tcW w:w="2474" w:type="pct"/>
+            <w:tcW w:w="2374" w:type="pct"/>
             <w:hideMark/>
           </w:tcPr>
           <w:p>
@@ -5447,7 +5447,7 @@
         </w:tc>
         <w:tc>
           <w:tcPr>
-            <w:tcW w:w="1661" w:type="pct"/>
+            <w:tcW w:w="1937" w:type="pct"/>
             <w:hideMark/>
           </w:tcPr>
           <w:p>
@@ -5467,7 +5467,7 @@
         </w:tc>
         <w:tc>
           <w:tcPr>
-            <w:tcW w:w="617" w:type="pct"/>
+            <w:tcW w:w="441" w:type="pct"/>
             <w:hideMark/>
           </w:tcPr>
           <w:p>
@@ -5487,7 +5487,7 @@
         </w:tc>
         <w:tc>
           <w:tcPr>
-            <w:tcW w:w="2474" w:type="pct"/>
+            <w:tcW w:w="2374" w:type="pct"/>
             <w:hideMark/>
           </w:tcPr>
           <w:p>
@@ -5529,7 +5529,7 @@
         </w:tc>
         <w:tc>
           <w:tcPr>
-            <w:tcW w:w="1661" w:type="pct"/>
+            <w:tcW w:w="1937" w:type="pct"/>
             <w:hideMark/>
           </w:tcPr>
           <w:p>
@@ -5549,7 +5549,7 @@
         </w:tc>
         <w:tc>
           <w:tcPr>
-            <w:tcW w:w="617" w:type="pct"/>
+            <w:tcW w:w="441" w:type="pct"/>
             <w:hideMark/>
           </w:tcPr>
           <w:p>
@@ -5569,7 +5569,7 @@
         </w:tc>
         <w:tc>
           <w:tcPr>
-            <w:tcW w:w="2474" w:type="pct"/>
+            <w:tcW w:w="2374" w:type="pct"/>
             <w:hideMark/>
           </w:tcPr>
           <w:p>
@@ -5611,7 +5611,7 @@
         </w:tc>
         <w:tc>
           <w:tcPr>
-            <w:tcW w:w="1661" w:type="pct"/>
+            <w:tcW w:w="1937" w:type="pct"/>
             <w:hideMark/>
           </w:tcPr>
           <w:p>
@@ -5631,7 +5631,7 @@
         </w:tc>
         <w:tc>
           <w:tcPr>
-            <w:tcW w:w="617" w:type="pct"/>
+            <w:tcW w:w="441" w:type="pct"/>
             <w:hideMark/>
           </w:tcPr>
           <w:p>
@@ -5651,7 +5651,7 @@
         </w:tc>
         <w:tc>
           <w:tcPr>
-            <w:tcW w:w="2474" w:type="pct"/>
+            <w:tcW w:w="2374" w:type="pct"/>
             <w:hideMark/>
           </w:tcPr>
           <w:p>
@@ -5693,7 +5693,7 @@
         </w:tc>
         <w:tc>
           <w:tcPr>
-            <w:tcW w:w="1661" w:type="pct"/>
+            <w:tcW w:w="1937" w:type="pct"/>
             <w:hideMark/>
           </w:tcPr>
           <w:p>
@@ -5713,7 +5713,7 @@
         </w:tc>
         <w:tc>
           <w:tcPr>
-            <w:tcW w:w="617" w:type="pct"/>
+            <w:tcW w:w="441" w:type="pct"/>
             <w:hideMark/>
           </w:tcPr>
           <w:p>
@@ -5733,7 +5733,7 @@
         </w:tc>
         <w:tc>
           <w:tcPr>
-            <w:tcW w:w="2474" w:type="pct"/>
+            <w:tcW w:w="2374" w:type="pct"/>
             <w:hideMark/>
           </w:tcPr>
           <w:p>
@@ -5775,7 +5775,7 @@
         </w:tc>
         <w:tc>
           <w:tcPr>
-            <w:tcW w:w="1661" w:type="pct"/>
+            <w:tcW w:w="1937" w:type="pct"/>
             <w:hideMark/>
           </w:tcPr>
           <w:p>
@@ -5795,7 +5795,7 @@
         </w:tc>
         <w:tc>
           <w:tcPr>
-            <w:tcW w:w="617" w:type="pct"/>
+            <w:tcW w:w="441" w:type="pct"/>
             <w:hideMark/>
           </w:tcPr>
           <w:p>
@@ -5815,7 +5815,7 @@
         </w:tc>
         <w:tc>
           <w:tcPr>
-            <w:tcW w:w="2474" w:type="pct"/>
+            <w:tcW w:w="2374" w:type="pct"/>
             <w:hideMark/>
           </w:tcPr>
           <w:p>
@@ -5864,7 +5864,7 @@
         </w:tc>
         <w:tc>
           <w:tcPr>
-            <w:tcW w:w="1661" w:type="pct"/>
+            <w:tcW w:w="1937" w:type="pct"/>
             <w:hideMark/>
           </w:tcPr>
           <w:p>
@@ -5884,7 +5884,7 @@
         </w:tc>
         <w:tc>
           <w:tcPr>
-            <w:tcW w:w="617" w:type="pct"/>
+            <w:tcW w:w="441" w:type="pct"/>
             <w:hideMark/>
           </w:tcPr>
           <w:p>
@@ -5904,7 +5904,7 @@
         </w:tc>
         <w:tc>
           <w:tcPr>
-            <w:tcW w:w="2474" w:type="pct"/>
+            <w:tcW w:w="2374" w:type="pct"/>
             <w:hideMark/>
           </w:tcPr>
           <w:p>
@@ -5953,7 +5953,7 @@
         </w:tc>
         <w:tc>
           <w:tcPr>
-            <w:tcW w:w="1661" w:type="pct"/>
+            <w:tcW w:w="1937" w:type="pct"/>
             <w:hideMark/>
           </w:tcPr>
           <w:p>
@@ -5973,7 +5973,7 @@
         </w:tc>
         <w:tc>
           <w:tcPr>
-            <w:tcW w:w="617" w:type="pct"/>
+            <w:tcW w:w="441" w:type="pct"/>
             <w:hideMark/>
           </w:tcPr>
           <w:p>
@@ -5993,7 +5993,7 @@
         </w:tc>
         <w:tc>
           <w:tcPr>
-            <w:tcW w:w="2474" w:type="pct"/>
+            <w:tcW w:w="2374" w:type="pct"/>
             <w:hideMark/>
           </w:tcPr>
           <w:p>
@@ -6035,7 +6035,7 @@
         </w:tc>
         <w:tc>
           <w:tcPr>
-            <w:tcW w:w="1661" w:type="pct"/>
+            <w:tcW w:w="1937" w:type="pct"/>
             <w:hideMark/>
           </w:tcPr>
           <w:p>
@@ -6055,7 +6055,7 @@
         </w:tc>
         <w:tc>
           <w:tcPr>
-            <w:tcW w:w="617" w:type="pct"/>
+            <w:tcW w:w="441" w:type="pct"/>
             <w:hideMark/>
           </w:tcPr>
           <w:p>
@@ -6075,7 +6075,7 @@
         </w:tc>
         <w:tc>
           <w:tcPr>
-            <w:tcW w:w="2474" w:type="pct"/>
+            <w:tcW w:w="2374" w:type="pct"/>
             <w:hideMark/>
           </w:tcPr>
           <w:p>
@@ -6117,7 +6117,7 @@
         </w:tc>
         <w:tc>
           <w:tcPr>
-            <w:tcW w:w="1661" w:type="pct"/>
+            <w:tcW w:w="1937" w:type="pct"/>
             <w:hideMark/>
           </w:tcPr>
           <w:p>
@@ -6137,7 +6137,7 @@
         </w:tc>
         <w:tc>
           <w:tcPr>
-            <w:tcW w:w="617" w:type="pct"/>
+            <w:tcW w:w="441" w:type="pct"/>
             <w:hideMark/>
           </w:tcPr>
           <w:p>
@@ -6157,7 +6157,7 @@
         </w:tc>
         <w:tc>
           <w:tcPr>
-            <w:tcW w:w="2474" w:type="pct"/>
+            <w:tcW w:w="2374" w:type="pct"/>
             <w:hideMark/>
           </w:tcPr>
           <w:p>
@@ -6200,7 +6200,7 @@
         </w:tc>
         <w:tc>
           <w:tcPr>
-            <w:tcW w:w="1661" w:type="pct"/>
+            <w:tcW w:w="1937" w:type="pct"/>
             <w:hideMark/>
           </w:tcPr>
           <w:p>
@@ -6220,7 +6220,7 @@
         </w:tc>
         <w:tc>
           <w:tcPr>
-            <w:tcW w:w="617" w:type="pct"/>
+            <w:tcW w:w="441" w:type="pct"/>
             <w:hideMark/>
           </w:tcPr>
           <w:p>
@@ -6240,7 +6240,7 @@
         </w:tc>
         <w:tc>
           <w:tcPr>
-            <w:tcW w:w="2474" w:type="pct"/>
+            <w:tcW w:w="2374" w:type="pct"/>
             <w:hideMark/>
           </w:tcPr>
           <w:p>
@@ -6282,7 +6282,7 @@
         </w:tc>
         <w:tc>
           <w:tcPr>
-            <w:tcW w:w="1661" w:type="pct"/>
+            <w:tcW w:w="1937" w:type="pct"/>
             <w:hideMark/>
           </w:tcPr>
           <w:p>
@@ -6302,7 +6302,7 @@
         </w:tc>
         <w:tc>
           <w:tcPr>
-            <w:tcW w:w="617" w:type="pct"/>
+            <w:tcW w:w="441" w:type="pct"/>
             <w:hideMark/>
           </w:tcPr>
           <w:p>
@@ -6322,7 +6322,7 @@
         </w:tc>
         <w:tc>
           <w:tcPr>
-            <w:tcW w:w="2474" w:type="pct"/>
+            <w:tcW w:w="2374" w:type="pct"/>
             <w:hideMark/>
           </w:tcPr>
           <w:p>
@@ -6364,7 +6364,7 @@
         </w:tc>
         <w:tc>
           <w:tcPr>
-            <w:tcW w:w="1661" w:type="pct"/>
+            <w:tcW w:w="1937" w:type="pct"/>
             <w:hideMark/>
           </w:tcPr>
           <w:p>
@@ -6384,7 +6384,7 @@
         </w:tc>
         <w:tc>
           <w:tcPr>
-            <w:tcW w:w="617" w:type="pct"/>
+            <w:tcW w:w="441" w:type="pct"/>
             <w:hideMark/>
           </w:tcPr>
           <w:p>
@@ -6404,7 +6404,7 @@
         </w:tc>
         <w:tc>
           <w:tcPr>
-            <w:tcW w:w="2474" w:type="pct"/>
+            <w:tcW w:w="2374" w:type="pct"/>
             <w:hideMark/>
           </w:tcPr>
           <w:p>
@@ -6446,7 +6446,7 @@
         </w:tc>
         <w:tc>
           <w:tcPr>
-            <w:tcW w:w="1661" w:type="pct"/>
+            <w:tcW w:w="1937" w:type="pct"/>
             <w:hideMark/>
           </w:tcPr>
           <w:p>
@@ -6466,7 +6466,7 @@
         </w:tc>
         <w:tc>
           <w:tcPr>
-            <w:tcW w:w="617" w:type="pct"/>
+            <w:tcW w:w="441" w:type="pct"/>
             <w:hideMark/>
           </w:tcPr>
           <w:p>
@@ -6486,7 +6486,7 @@
         </w:tc>
         <w:tc>
           <w:tcPr>
-            <w:tcW w:w="2474" w:type="pct"/>
+            <w:tcW w:w="2374" w:type="pct"/>
             <w:hideMark/>
           </w:tcPr>
           <w:p>
@@ -6528,7 +6528,7 @@
         </w:tc>
         <w:tc>
           <w:tcPr>
-            <w:tcW w:w="1661" w:type="pct"/>
+            <w:tcW w:w="1937" w:type="pct"/>
             <w:hideMark/>
           </w:tcPr>
           <w:p>
@@ -6548,7 +6548,7 @@
         </w:tc>
         <w:tc>
           <w:tcPr>
-            <w:tcW w:w="617" w:type="pct"/>
+            <w:tcW w:w="441" w:type="pct"/>
             <w:hideMark/>
           </w:tcPr>
           <w:p>
@@ -6568,7 +6568,7 @@
         </w:tc>
         <w:tc>
           <w:tcPr>
-            <w:tcW w:w="2474" w:type="pct"/>
+            <w:tcW w:w="2374" w:type="pct"/>
             <w:hideMark/>
           </w:tcPr>
           <w:p>
@@ -6610,7 +6610,7 @@
         </w:tc>
         <w:tc>
           <w:tcPr>
-            <w:tcW w:w="1661" w:type="pct"/>
+            <w:tcW w:w="1937" w:type="pct"/>
             <w:hideMark/>
           </w:tcPr>
           <w:p>
@@ -6630,7 +6630,7 @@
         </w:tc>
         <w:tc>
           <w:tcPr>
-            <w:tcW w:w="617" w:type="pct"/>
+            <w:tcW w:w="441" w:type="pct"/>
             <w:hideMark/>
           </w:tcPr>
           <w:p>
@@ -6650,7 +6650,7 @@
         </w:tc>
         <w:tc>
           <w:tcPr>
-            <w:tcW w:w="2474" w:type="pct"/>
+            <w:tcW w:w="2374" w:type="pct"/>
             <w:hideMark/>
           </w:tcPr>
           <w:p>
@@ -6699,7 +6699,7 @@
         </w:tc>
         <w:tc>
           <w:tcPr>
-            <w:tcW w:w="1661" w:type="pct"/>
+            <w:tcW w:w="1937" w:type="pct"/>
             <w:hideMark/>
           </w:tcPr>
           <w:p>
@@ -6719,7 +6719,7 @@
         </w:tc>
         <w:tc>
           <w:tcPr>
-            <w:tcW w:w="617" w:type="pct"/>
+            <w:tcW w:w="441" w:type="pct"/>
             <w:hideMark/>
           </w:tcPr>
           <w:p>
@@ -6739,7 +6739,7 @@
         </w:tc>
         <w:tc>
           <w:tcPr>
-            <w:tcW w:w="2474" w:type="pct"/>
+            <w:tcW w:w="2374" w:type="pct"/>
             <w:hideMark/>
           </w:tcPr>
           <w:p>
@@ -6781,7 +6781,7 @@
         </w:tc>
         <w:tc>
           <w:tcPr>
-            <w:tcW w:w="1661" w:type="pct"/>
+            <w:tcW w:w="1937" w:type="pct"/>
             <w:hideMark/>
           </w:tcPr>
           <w:p>
@@ -6801,7 +6801,7 @@
         </w:tc>
         <w:tc>
           <w:tcPr>
-            <w:tcW w:w="617" w:type="pct"/>
+            <w:tcW w:w="441" w:type="pct"/>
             <w:hideMark/>
           </w:tcPr>
           <w:p>
@@ -6828,7 +6828,7 @@
         </w:tc>
         <w:tc>
           <w:tcPr>
-            <w:tcW w:w="2474" w:type="pct"/>
+            <w:tcW w:w="2374" w:type="pct"/>
             <w:hideMark/>
           </w:tcPr>
           <w:p>
@@ -6878,7 +6878,7 @@
         </w:tc>
         <w:tc>
           <w:tcPr>
-            <w:tcW w:w="1661" w:type="pct"/>
+            <w:tcW w:w="1937" w:type="pct"/>
             <w:hideMark/>
           </w:tcPr>
           <w:p>
@@ -6898,7 +6898,7 @@
         </w:tc>
         <w:tc>
           <w:tcPr>
-            <w:tcW w:w="617" w:type="pct"/>
+            <w:tcW w:w="441" w:type="pct"/>
             <w:hideMark/>
           </w:tcPr>
           <w:p>
@@ -6918,7 +6918,7 @@
         </w:tc>
         <w:tc>
           <w:tcPr>
-            <w:tcW w:w="2474" w:type="pct"/>
+            <w:tcW w:w="2374" w:type="pct"/>
             <w:hideMark/>
           </w:tcPr>
           <w:p>
@@ -6967,7 +6967,7 @@
         </w:tc>
         <w:tc>
           <w:tcPr>
-            <w:tcW w:w="1661" w:type="pct"/>
+            <w:tcW w:w="1937" w:type="pct"/>
             <w:hideMark/>
           </w:tcPr>
           <w:p>
@@ -6987,7 +6987,7 @@
         </w:tc>
         <w:tc>
           <w:tcPr>
-            <w:tcW w:w="617" w:type="pct"/>
+            <w:tcW w:w="441" w:type="pct"/>
             <w:hideMark/>
           </w:tcPr>
           <w:p>
@@ -7007,7 +7007,7 @@
         </w:tc>
         <w:tc>
           <w:tcPr>
-            <w:tcW w:w="2474" w:type="pct"/>
+            <w:tcW w:w="2374" w:type="pct"/>
             <w:hideMark/>
           </w:tcPr>
           <w:p>
@@ -7049,7 +7049,7 @@
         </w:tc>
         <w:tc>
           <w:tcPr>
-            <w:tcW w:w="1661" w:type="pct"/>
+            <w:tcW w:w="1937" w:type="pct"/>
             <w:hideMark/>
           </w:tcPr>
           <w:p>
@@ -7069,7 +7069,7 @@
         </w:tc>
         <w:tc>
           <w:tcPr>
-            <w:tcW w:w="617" w:type="pct"/>
+            <w:tcW w:w="441" w:type="pct"/>
             <w:hideMark/>
           </w:tcPr>
           <w:p>
@@ -7089,7 +7089,7 @@
         </w:tc>
         <w:tc>
           <w:tcPr>
-            <w:tcW w:w="2474" w:type="pct"/>
+            <w:tcW w:w="2374" w:type="pct"/>
             <w:hideMark/>
           </w:tcPr>
           <w:p>
@@ -7131,7 +7131,7 @@
         </w:tc>
         <w:tc>
           <w:tcPr>
-            <w:tcW w:w="1661" w:type="pct"/>
+            <w:tcW w:w="1937" w:type="pct"/>
             <w:hideMark/>
           </w:tcPr>
           <w:p>
@@ -7151,7 +7151,7 @@
         </w:tc>
         <w:tc>
           <w:tcPr>
-            <w:tcW w:w="617" w:type="pct"/>
+            <w:tcW w:w="441" w:type="pct"/>
             <w:hideMark/>
           </w:tcPr>
           <w:p>
@@ -7171,7 +7171,7 @@
         </w:tc>
         <w:tc>
           <w:tcPr>
-            <w:tcW w:w="2474" w:type="pct"/>
+            <w:tcW w:w="2374" w:type="pct"/>
             <w:hideMark/>
           </w:tcPr>
           <w:p>
@@ -7191,6 +7191,1483 @@
         </w:tc>
       </w:tr>
     </w:tbl>
+    <w:p>
+      <w:pPr>
+        <w:spacing w:line="360" w:lineRule="auto"/>
+        <w:rPr>
+          <w:rFonts w:ascii="Times New Roman" w:hAnsi="Times New Roman" w:cs="Times New Roman"/>
+          <w:b/>
+          <w:bCs/>
+        </w:rPr>
+      </w:pPr>
+      <w:r>
+        <w:rPr>
+          <w:rFonts w:ascii="Segoe UI Emoji" w:hAnsi="Segoe UI Emoji" w:cs="Segoe UI Emoji"/>
+          <w:b/>
+          <w:bCs/>
+        </w:rPr>
+        <w:t>📦</w:t>
+      </w:r>
+      <w:r>
+        <w:rPr>
+          <w:rFonts w:ascii="Times New Roman" w:hAnsi="Times New Roman" w:cs="Times New Roman"/>
+          <w:b/>
+          <w:bCs/>
+        </w:rPr>
+        <w:t xml:space="preserve"> Giai đoạn 1 – Hoàn thiện chức năng cốt lõi đang có (Tuần 1 – 2)</w:t>
+      </w:r>
+    </w:p>
+    <w:p>
+      <w:pPr>
+        <w:spacing w:line="360" w:lineRule="auto"/>
+        <w:rPr>
+          <w:rFonts w:ascii="Times New Roman" w:hAnsi="Times New Roman" w:cs="Times New Roman"/>
+        </w:rPr>
+      </w:pPr>
+      <w:r>
+        <w:rPr>
+          <w:rFonts w:ascii="Times New Roman" w:hAnsi="Times New Roman" w:cs="Times New Roman"/>
+          <w:b/>
+          <w:bCs/>
+        </w:rPr>
+        <w:t>Mục tiêu:</w:t>
+      </w:r>
+      <w:r>
+        <w:rPr>
+          <w:rFonts w:ascii="Times New Roman" w:hAnsi="Times New Roman" w:cs="Times New Roman"/>
+        </w:rPr>
+        <w:t> Chuẩn hóa và bổ sung nhanh các chức năng còn dang dở để sớm có luồng nghiệp vụ cơ bản.</w:t>
+      </w:r>
+    </w:p>
+    <w:p>
+      <w:pPr>
+        <w:numPr>
+          <w:ilvl w:val="0"/>
+          <w:numId w:val="6"/>
+        </w:numPr>
+        <w:spacing w:line="360" w:lineRule="auto"/>
+        <w:rPr>
+          <w:rFonts w:ascii="Times New Roman" w:hAnsi="Times New Roman" w:cs="Times New Roman"/>
+        </w:rPr>
+      </w:pPr>
+      <w:r>
+        <w:rPr>
+          <w:rFonts w:ascii="Times New Roman" w:hAnsi="Times New Roman" w:cs="Times New Roman"/>
+          <w:b/>
+          <w:bCs/>
+        </w:rPr>
+        <w:t>01 – Đăng ký, đăng nhập</w:t>
+      </w:r>
+      <w:r>
+        <w:rPr>
+          <w:rFonts w:ascii="Times New Roman" w:hAnsi="Times New Roman" w:cs="Times New Roman"/>
+        </w:rPr>
+        <w:t> (đã có, cần test lại)</w:t>
+      </w:r>
+    </w:p>
+    <w:p>
+      <w:pPr>
+        <w:numPr>
+          <w:ilvl w:val="0"/>
+          <w:numId w:val="6"/>
+        </w:numPr>
+        <w:spacing w:line="360" w:lineRule="auto"/>
+        <w:rPr>
+          <w:rFonts w:ascii="Times New Roman" w:hAnsi="Times New Roman" w:cs="Times New Roman"/>
+        </w:rPr>
+      </w:pPr>
+      <w:r>
+        <w:rPr>
+          <w:rFonts w:ascii="Times New Roman" w:hAnsi="Times New Roman" w:cs="Times New Roman"/>
+          <w:b/>
+          <w:bCs/>
+        </w:rPr>
+        <w:t>08 – CRUD Listing</w:t>
+      </w:r>
+      <w:r>
+        <w:rPr>
+          <w:rFonts w:ascii="Times New Roman" w:hAnsi="Times New Roman" w:cs="Times New Roman"/>
+        </w:rPr>
+        <w:t> (đã có thêm, sửa; cần UI nút </w:t>
+      </w:r>
+      <w:r>
+        <w:rPr>
+          <w:rFonts w:ascii="Times New Roman" w:hAnsi="Times New Roman" w:cs="Times New Roman"/>
+          <w:b/>
+          <w:bCs/>
+        </w:rPr>
+        <w:t>Xóa</w:t>
+      </w:r>
+      <w:r>
+        <w:rPr>
+          <w:rFonts w:ascii="Times New Roman" w:hAnsi="Times New Roman" w:cs="Times New Roman"/>
+        </w:rPr>
+        <w:t>)</w:t>
+      </w:r>
+    </w:p>
+    <w:p>
+      <w:pPr>
+        <w:numPr>
+          <w:ilvl w:val="0"/>
+          <w:numId w:val="6"/>
+        </w:numPr>
+        <w:spacing w:line="360" w:lineRule="auto"/>
+        <w:rPr>
+          <w:rFonts w:ascii="Times New Roman" w:hAnsi="Times New Roman" w:cs="Times New Roman"/>
+        </w:rPr>
+      </w:pPr>
+      <w:r>
+        <w:rPr>
+          <w:rFonts w:ascii="Times New Roman" w:hAnsi="Times New Roman" w:cs="Times New Roman"/>
+          <w:b/>
+          <w:bCs/>
+        </w:rPr>
+        <w:t>12 – Giá theo ngày</w:t>
+      </w:r>
+      <w:r>
+        <w:rPr>
+          <w:rFonts w:ascii="Times New Roman" w:hAnsi="Times New Roman" w:cs="Times New Roman"/>
+        </w:rPr>
+        <w:t> (làm form lịch giá, kết nối bảng ItemPrices, CancellationPolicies)</w:t>
+      </w:r>
+    </w:p>
+    <w:p>
+      <w:pPr>
+        <w:numPr>
+          <w:ilvl w:val="0"/>
+          <w:numId w:val="6"/>
+        </w:numPr>
+        <w:spacing w:line="360" w:lineRule="auto"/>
+        <w:rPr>
+          <w:rFonts w:ascii="Times New Roman" w:hAnsi="Times New Roman" w:cs="Times New Roman"/>
+        </w:rPr>
+      </w:pPr>
+      <w:r>
+        <w:rPr>
+          <w:rFonts w:ascii="Times New Roman" w:hAnsi="Times New Roman" w:cs="Times New Roman"/>
+          <w:b/>
+          <w:bCs/>
+        </w:rPr>
+        <w:t>13 – Tình trạng phòng trống</w:t>
+      </w:r>
+      <w:r>
+        <w:rPr>
+          <w:rFonts w:ascii="Times New Roman" w:hAnsi="Times New Roman" w:cs="Times New Roman"/>
+        </w:rPr>
+        <w:t> (tích hợp vào form giá – mở/đóng ngày, ItemAvailability)</w:t>
+      </w:r>
+    </w:p>
+    <w:p>
+      <w:pPr>
+        <w:numPr>
+          <w:ilvl w:val="0"/>
+          <w:numId w:val="6"/>
+        </w:numPr>
+        <w:spacing w:line="360" w:lineRule="auto"/>
+        <w:rPr>
+          <w:rFonts w:ascii="Times New Roman" w:hAnsi="Times New Roman" w:cs="Times New Roman"/>
+        </w:rPr>
+      </w:pPr>
+      <w:r>
+        <w:rPr>
+          <w:rFonts w:ascii="Times New Roman" w:hAnsi="Times New Roman" w:cs="Times New Roman"/>
+          <w:b/>
+          <w:bCs/>
+        </w:rPr>
+        <w:t>14 – Chính sách hủy</w:t>
+      </w:r>
+      <w:r>
+        <w:rPr>
+          <w:rFonts w:ascii="Times New Roman" w:hAnsi="Times New Roman" w:cs="Times New Roman"/>
+        </w:rPr>
+        <w:t> (hoàn thiện DAL/BUS xem danh sách policy và bảng phí)</w:t>
+      </w:r>
+    </w:p>
+    <w:p>
+      <w:pPr>
+        <w:numPr>
+          <w:ilvl w:val="0"/>
+          <w:numId w:val="6"/>
+        </w:numPr>
+        <w:spacing w:line="360" w:lineRule="auto"/>
+        <w:rPr>
+          <w:rFonts w:ascii="Times New Roman" w:hAnsi="Times New Roman" w:cs="Times New Roman"/>
+        </w:rPr>
+      </w:pPr>
+      <w:r>
+        <w:rPr>
+          <w:rFonts w:ascii="Times New Roman" w:hAnsi="Times New Roman" w:cs="Times New Roman"/>
+          <w:b/>
+          <w:bCs/>
+        </w:rPr>
+        <w:t>04 – Tài khoản ngân hàng Host</w:t>
+      </w:r>
+      <w:r>
+        <w:rPr>
+          <w:rFonts w:ascii="Times New Roman" w:hAnsi="Times New Roman" w:cs="Times New Roman"/>
+        </w:rPr>
+        <w:t> (form quản lý bank account, thêm/sửa/đặt primary)</w:t>
+      </w:r>
+    </w:p>
+    <w:p>
+      <w:pPr>
+        <w:numPr>
+          <w:ilvl w:val="0"/>
+          <w:numId w:val="6"/>
+        </w:numPr>
+        <w:spacing w:line="360" w:lineRule="auto"/>
+        <w:rPr>
+          <w:rFonts w:ascii="Times New Roman" w:hAnsi="Times New Roman" w:cs="Times New Roman"/>
+        </w:rPr>
+      </w:pPr>
+      <w:r>
+        <w:rPr>
+          <w:rFonts w:ascii="Times New Roman" w:hAnsi="Times New Roman" w:cs="Times New Roman"/>
+          <w:b/>
+          <w:bCs/>
+        </w:rPr>
+        <w:t>02 – Hồ sơ Guest</w:t>
+      </w:r>
+      <w:r>
+        <w:rPr>
+          <w:rFonts w:ascii="Times New Roman" w:hAnsi="Times New Roman" w:cs="Times New Roman"/>
+        </w:rPr>
+        <w:t> (form xem/sửa ảnh đại diện, ngôn ngữ, loyalty…)</w:t>
+      </w:r>
+    </w:p>
+    <w:p>
+      <w:pPr>
+        <w:numPr>
+          <w:ilvl w:val="0"/>
+          <w:numId w:val="6"/>
+        </w:numPr>
+        <w:spacing w:line="360" w:lineRule="auto"/>
+        <w:rPr>
+          <w:rFonts w:ascii="Times New Roman" w:hAnsi="Times New Roman" w:cs="Times New Roman"/>
+        </w:rPr>
+      </w:pPr>
+      <w:r>
+        <w:rPr>
+          <w:rFonts w:ascii="Times New Roman" w:hAnsi="Times New Roman" w:cs="Times New Roman"/>
+          <w:b/>
+          <w:bCs/>
+        </w:rPr>
+        <w:lastRenderedPageBreak/>
+        <w:t>03 – Hồ sơ Host</w:t>
+      </w:r>
+      <w:r>
+        <w:rPr>
+          <w:rFonts w:ascii="Times New Roman" w:hAnsi="Times New Roman" w:cs="Times New Roman"/>
+        </w:rPr>
+        <w:t> (xem/sửa giấy phép, tax code, rating)</w:t>
+      </w:r>
+    </w:p>
+    <w:p>
+      <w:pPr>
+        <w:numPr>
+          <w:ilvl w:val="0"/>
+          <w:numId w:val="6"/>
+        </w:numPr>
+        <w:spacing w:line="360" w:lineRule="auto"/>
+        <w:rPr>
+          <w:rFonts w:ascii="Times New Roman" w:hAnsi="Times New Roman" w:cs="Times New Roman"/>
+        </w:rPr>
+      </w:pPr>
+      <w:r>
+        <w:rPr>
+          <w:rFonts w:ascii="Times New Roman" w:hAnsi="Times New Roman" w:cs="Times New Roman"/>
+          <w:b/>
+          <w:bCs/>
+        </w:rPr>
+        <w:t>05 – Nâng cấp Guest → Host</w:t>
+      </w:r>
+      <w:r>
+        <w:rPr>
+          <w:rFonts w:ascii="Times New Roman" w:hAnsi="Times New Roman" w:cs="Times New Roman"/>
+        </w:rPr>
+        <w:t> (button "Trở thành chủ nhà", gửi yêu cầu duyệt)</w:t>
+      </w:r>
+    </w:p>
+    <w:p>
+      <w:pPr>
+        <w:spacing w:line="360" w:lineRule="auto"/>
+        <w:rPr>
+          <w:rFonts w:ascii="Times New Roman" w:hAnsi="Times New Roman" w:cs="Times New Roman"/>
+        </w:rPr>
+      </w:pPr>
+      <w:r>
+        <w:rPr>
+          <w:rFonts w:ascii="Times New Roman" w:hAnsi="Times New Roman" w:cs="Times New Roman"/>
+          <w:b/>
+          <w:bCs/>
+        </w:rPr>
+        <w:t>Kết quả:</w:t>
+      </w:r>
+      <w:r>
+        <w:rPr>
+          <w:rFonts w:ascii="Times New Roman" w:hAnsi="Times New Roman" w:cs="Times New Roman"/>
+        </w:rPr>
+        <w:t> Host có thể đăng ký làm chủ nhà, tạo listing, gán giá, thiết lập chính sách hủy. Guest có hồ sơ cơ bản.</w:t>
+      </w:r>
+    </w:p>
+    <w:p>
+      <w:pPr>
+        <w:spacing w:line="360" w:lineRule="auto"/>
+        <w:rPr>
+          <w:rFonts w:ascii="Times New Roman" w:hAnsi="Times New Roman" w:cs="Times New Roman"/>
+        </w:rPr>
+      </w:pPr>
+      <w:r>
+        <w:rPr>
+          <w:rFonts w:ascii="Times New Roman" w:hAnsi="Times New Roman" w:cs="Times New Roman"/>
+        </w:rPr>
+        <w:pict w14:anchorId="5A530C79">
+          <v:rect id="_x0000_i1049" style="width:0;height:.75pt" o:hralign="center" o:hrstd="t" o:hr="t" fillcolor="#a0a0a0" stroked="f"/>
+        </w:pict>
+      </w:r>
+    </w:p>
+    <w:p>
+      <w:pPr>
+        <w:spacing w:line="360" w:lineRule="auto"/>
+        <w:rPr>
+          <w:rFonts w:ascii="Times New Roman" w:hAnsi="Times New Roman" w:cs="Times New Roman"/>
+          <w:b/>
+          <w:bCs/>
+        </w:rPr>
+      </w:pPr>
+      <w:r>
+        <w:rPr>
+          <w:rFonts w:ascii="Segoe UI Emoji" w:hAnsi="Segoe UI Emoji" w:cs="Segoe UI Emoji"/>
+          <w:b/>
+          <w:bCs/>
+        </w:rPr>
+        <w:t>📦</w:t>
+      </w:r>
+      <w:r>
+        <w:rPr>
+          <w:rFonts w:ascii="Times New Roman" w:hAnsi="Times New Roman" w:cs="Times New Roman"/>
+          <w:b/>
+          <w:bCs/>
+        </w:rPr>
+        <w:t xml:space="preserve"> Giai đoạn 2 – Luồng đặt phòng và thanh toán (Tuần 3 – 4)</w:t>
+      </w:r>
+    </w:p>
+    <w:p>
+      <w:pPr>
+        <w:spacing w:line="360" w:lineRule="auto"/>
+        <w:rPr>
+          <w:rFonts w:ascii="Times New Roman" w:hAnsi="Times New Roman" w:cs="Times New Roman"/>
+        </w:rPr>
+      </w:pPr>
+      <w:r>
+        <w:rPr>
+          <w:rFonts w:ascii="Times New Roman" w:hAnsi="Times New Roman" w:cs="Times New Roman"/>
+          <w:b/>
+          <w:bCs/>
+        </w:rPr>
+        <w:t>Mục tiêu:</w:t>
+      </w:r>
+      <w:r>
+        <w:rPr>
+          <w:rFonts w:ascii="Times New Roman" w:hAnsi="Times New Roman" w:cs="Times New Roman"/>
+        </w:rPr>
+        <w:t> Guest có thể tìm kiếm, đặt phòng, sử dụng coupon, hủy booking. Host quản lý booking.</w:t>
+      </w:r>
+    </w:p>
+    <w:p>
+      <w:pPr>
+        <w:numPr>
+          <w:ilvl w:val="0"/>
+          <w:numId w:val="7"/>
+        </w:numPr>
+        <w:spacing w:line="360" w:lineRule="auto"/>
+        <w:rPr>
+          <w:rFonts w:ascii="Times New Roman" w:hAnsi="Times New Roman" w:cs="Times New Roman"/>
+        </w:rPr>
+      </w:pPr>
+      <w:r>
+        <w:rPr>
+          <w:rFonts w:ascii="Times New Roman" w:hAnsi="Times New Roman" w:cs="Times New Roman"/>
+          <w:b/>
+          <w:bCs/>
+        </w:rPr>
+        <w:t>15 – Tìm kiếm chỗ ở</w:t>
+      </w:r>
+      <w:r>
+        <w:rPr>
+          <w:rFonts w:ascii="Times New Roman" w:hAnsi="Times New Roman" w:cs="Times New Roman"/>
+        </w:rPr>
+        <w:t> (đã có giao diện, cần kiểm tra logic tìm theo attraction và tối ưu)</w:t>
+      </w:r>
+    </w:p>
+    <w:p>
+      <w:pPr>
+        <w:numPr>
+          <w:ilvl w:val="0"/>
+          <w:numId w:val="7"/>
+        </w:numPr>
+        <w:spacing w:line="360" w:lineRule="auto"/>
+        <w:rPr>
+          <w:rFonts w:ascii="Times New Roman" w:hAnsi="Times New Roman" w:cs="Times New Roman"/>
+        </w:rPr>
+      </w:pPr>
+      <w:r>
+        <w:rPr>
+          <w:rFonts w:ascii="Times New Roman" w:hAnsi="Times New Roman" w:cs="Times New Roman"/>
+          <w:b/>
+          <w:bCs/>
+        </w:rPr>
+        <w:t>16 – Tạo đặt phòng</w:t>
+      </w:r>
+      <w:r>
+        <w:rPr>
+          <w:rFonts w:ascii="Times New Roman" w:hAnsi="Times New Roman" w:cs="Times New Roman"/>
+        </w:rPr>
+        <w:t> (form đặt phòng: chọn ngày, số khách, tính tiền, kiểm tra availability, tạo booking + transaction)</w:t>
+      </w:r>
+    </w:p>
+    <w:p>
+      <w:pPr>
+        <w:numPr>
+          <w:ilvl w:val="0"/>
+          <w:numId w:val="7"/>
+        </w:numPr>
+        <w:spacing w:line="360" w:lineRule="auto"/>
+        <w:rPr>
+          <w:rFonts w:ascii="Times New Roman" w:hAnsi="Times New Roman" w:cs="Times New Roman"/>
+        </w:rPr>
+      </w:pPr>
+      <w:r>
+        <w:rPr>
+          <w:rFonts w:ascii="Times New Roman" w:hAnsi="Times New Roman" w:cs="Times New Roman"/>
+          <w:b/>
+          <w:bCs/>
+        </w:rPr>
+        <w:t>17 – Áp dụng coupon</w:t>
+      </w:r>
+      <w:r>
+        <w:rPr>
+          <w:rFonts w:ascii="Times New Roman" w:hAnsi="Times New Roman" w:cs="Times New Roman"/>
+        </w:rPr>
+        <w:t> (ô nhập coupon trong form đặt phòng, validate tồn tại, hạn dùng)</w:t>
+      </w:r>
+    </w:p>
+    <w:p>
+      <w:pPr>
+        <w:numPr>
+          <w:ilvl w:val="0"/>
+          <w:numId w:val="7"/>
+        </w:numPr>
+        <w:spacing w:line="360" w:lineRule="auto"/>
+        <w:rPr>
+          <w:rFonts w:ascii="Times New Roman" w:hAnsi="Times New Roman" w:cs="Times New Roman"/>
+        </w:rPr>
+      </w:pPr>
+      <w:r>
+        <w:rPr>
+          <w:rFonts w:ascii="Times New Roman" w:hAnsi="Times New Roman" w:cs="Times New Roman"/>
+          <w:b/>
+          <w:bCs/>
+        </w:rPr>
+        <w:t>18 – Hủy đặt phòng</w:t>
+      </w:r>
+      <w:r>
+        <w:rPr>
+          <w:rFonts w:ascii="Times New Roman" w:hAnsi="Times New Roman" w:cs="Times New Roman"/>
+        </w:rPr>
+        <w:t> (tính phí dựa trên chính sách hủy, tạo transaction Refund, cập nhật availability)</w:t>
+      </w:r>
+    </w:p>
+    <w:p>
+      <w:pPr>
+        <w:numPr>
+          <w:ilvl w:val="0"/>
+          <w:numId w:val="7"/>
+        </w:numPr>
+        <w:spacing w:line="360" w:lineRule="auto"/>
+        <w:rPr>
+          <w:rFonts w:ascii="Times New Roman" w:hAnsi="Times New Roman" w:cs="Times New Roman"/>
+        </w:rPr>
+      </w:pPr>
+      <w:r>
+        <w:rPr>
+          <w:rFonts w:ascii="Times New Roman" w:hAnsi="Times New Roman" w:cs="Times New Roman"/>
+          <w:b/>
+          <w:bCs/>
+        </w:rPr>
+        <w:t>19 – Quản lý trạng thái booking</w:t>
+      </w:r>
+      <w:r>
+        <w:rPr>
+          <w:rFonts w:ascii="Times New Roman" w:hAnsi="Times New Roman" w:cs="Times New Roman"/>
+        </w:rPr>
+        <w:t> (Host xác nhận, check</w:t>
+      </w:r>
+      <w:r>
+        <w:rPr>
+          <w:rFonts w:ascii="Times New Roman" w:hAnsi="Times New Roman" w:cs="Times New Roman"/>
+        </w:rPr>
+        <w:noBreakHyphen/>
+        <w:t>in, hoàn thành, tự động complete…)</w:t>
+      </w:r>
+    </w:p>
+    <w:p>
+      <w:pPr>
+        <w:numPr>
+          <w:ilvl w:val="0"/>
+          <w:numId w:val="7"/>
+        </w:numPr>
+        <w:spacing w:line="360" w:lineRule="auto"/>
+        <w:rPr>
+          <w:rFonts w:ascii="Times New Roman" w:hAnsi="Times New Roman" w:cs="Times New Roman"/>
+        </w:rPr>
+      </w:pPr>
+      <w:r>
+        <w:rPr>
+          <w:rFonts w:ascii="Times New Roman" w:hAnsi="Times New Roman" w:cs="Times New Roman"/>
+          <w:b/>
+          <w:bCs/>
+        </w:rPr>
+        <w:t>28 – Giao dịch thanh toán &amp; rút tiền</w:t>
+      </w:r>
+      <w:r>
+        <w:rPr>
+          <w:rFonts w:ascii="Times New Roman" w:hAnsi="Times New Roman" w:cs="Times New Roman"/>
+        </w:rPr>
+        <w:t> (tạo transaction Payment khi đặt, Refund khi hủy, Payout khi host rút tiền)</w:t>
+      </w:r>
+    </w:p>
+    <w:p>
+      <w:pPr>
+        <w:numPr>
+          <w:ilvl w:val="0"/>
+          <w:numId w:val="7"/>
+        </w:numPr>
+        <w:spacing w:line="360" w:lineRule="auto"/>
+        <w:rPr>
+          <w:rFonts w:ascii="Times New Roman" w:hAnsi="Times New Roman" w:cs="Times New Roman"/>
+        </w:rPr>
+      </w:pPr>
+      <w:r>
+        <w:rPr>
+          <w:rFonts w:ascii="Times New Roman" w:hAnsi="Times New Roman" w:cs="Times New Roman"/>
+          <w:b/>
+          <w:bCs/>
+        </w:rPr>
+        <w:t>29 – Quản lý Coupon</w:t>
+      </w:r>
+      <w:r>
+        <w:rPr>
+          <w:rFonts w:ascii="Times New Roman" w:hAnsi="Times New Roman" w:cs="Times New Roman"/>
+        </w:rPr>
+        <w:t> (Admin thêm/sửa/xóa coupon)</w:t>
+      </w:r>
+    </w:p>
+    <w:p>
+      <w:pPr>
+        <w:spacing w:line="360" w:lineRule="auto"/>
+        <w:rPr>
+          <w:rFonts w:ascii="Times New Roman" w:hAnsi="Times New Roman" w:cs="Times New Roman"/>
+        </w:rPr>
+      </w:pPr>
+      <w:r>
+        <w:rPr>
+          <w:rFonts w:ascii="Times New Roman" w:hAnsi="Times New Roman" w:cs="Times New Roman"/>
+          <w:b/>
+          <w:bCs/>
+        </w:rPr>
+        <w:t>Kết quả:</w:t>
+      </w:r>
+      <w:r>
+        <w:rPr>
+          <w:rFonts w:ascii="Times New Roman" w:hAnsi="Times New Roman" w:cs="Times New Roman"/>
+        </w:rPr>
+        <w:t> Toàn bộ vòng đời booking được hoàn chỉnh: đặt → xác nhận → check</w:t>
+      </w:r>
+      <w:r>
+        <w:rPr>
+          <w:rFonts w:ascii="Times New Roman" w:hAnsi="Times New Roman" w:cs="Times New Roman"/>
+        </w:rPr>
+        <w:noBreakHyphen/>
+        <w:t>in → hoàn thành hoặc hủy.</w:t>
+      </w:r>
+    </w:p>
+    <w:p>
+      <w:pPr>
+        <w:spacing w:line="360" w:lineRule="auto"/>
+        <w:rPr>
+          <w:rFonts w:ascii="Times New Roman" w:hAnsi="Times New Roman" w:cs="Times New Roman"/>
+        </w:rPr>
+      </w:pPr>
+      <w:r>
+        <w:rPr>
+          <w:rFonts w:ascii="Times New Roman" w:hAnsi="Times New Roman" w:cs="Times New Roman"/>
+        </w:rPr>
+        <w:pict w14:anchorId="3F1251CD">
+          <v:rect id="_x0000_i1050" style="width:0;height:.75pt" o:hralign="center" o:hrstd="t" o:hr="t" fillcolor="#a0a0a0" stroked="f"/>
+        </w:pict>
+      </w:r>
+    </w:p>
+    <w:p>
+      <w:pPr>
+        <w:spacing w:line="360" w:lineRule="auto"/>
+        <w:rPr>
+          <w:rFonts w:ascii="Times New Roman" w:hAnsi="Times New Roman" w:cs="Times New Roman"/>
+          <w:b/>
+          <w:bCs/>
+        </w:rPr>
+      </w:pPr>
+      <w:r>
+        <w:rPr>
+          <w:rFonts w:ascii="Segoe UI Emoji" w:hAnsi="Segoe UI Emoji" w:cs="Segoe UI Emoji"/>
+          <w:b/>
+          <w:bCs/>
+        </w:rPr>
+        <w:t>📦</w:t>
+      </w:r>
+      <w:r>
+        <w:rPr>
+          <w:rFonts w:ascii="Times New Roman" w:hAnsi="Times New Roman" w:cs="Times New Roman"/>
+          <w:b/>
+          <w:bCs/>
+        </w:rPr>
+        <w:t xml:space="preserve"> Giai đoạn 3 – Dịch vụ bổ sung và hệ thống đánh giá (Tuần 5 – 6)</w:t>
+      </w:r>
+    </w:p>
+    <w:p>
+      <w:pPr>
+        <w:spacing w:line="360" w:lineRule="auto"/>
+        <w:rPr>
+          <w:rFonts w:ascii="Times New Roman" w:hAnsi="Times New Roman" w:cs="Times New Roman"/>
+        </w:rPr>
+      </w:pPr>
+      <w:r>
+        <w:rPr>
+          <w:rFonts w:ascii="Times New Roman" w:hAnsi="Times New Roman" w:cs="Times New Roman"/>
+          <w:b/>
+          <w:bCs/>
+        </w:rPr>
+        <w:lastRenderedPageBreak/>
+        <w:t>Mục tiêu:</w:t>
+      </w:r>
+      <w:r>
+        <w:rPr>
+          <w:rFonts w:ascii="Times New Roman" w:hAnsi="Times New Roman" w:cs="Times New Roman"/>
+        </w:rPr>
+        <w:t> Thêm add</w:t>
+      </w:r>
+      <w:r>
+        <w:rPr>
+          <w:rFonts w:ascii="Times New Roman" w:hAnsi="Times New Roman" w:cs="Times New Roman"/>
+        </w:rPr>
+        <w:noBreakHyphen/>
+        <w:t>on services, review đa tiêu chí, điểm loyalty.</w:t>
+      </w:r>
+    </w:p>
+    <w:p>
+      <w:pPr>
+        <w:numPr>
+          <w:ilvl w:val="0"/>
+          <w:numId w:val="8"/>
+        </w:numPr>
+        <w:spacing w:line="360" w:lineRule="auto"/>
+        <w:rPr>
+          <w:rFonts w:ascii="Times New Roman" w:hAnsi="Times New Roman" w:cs="Times New Roman"/>
+        </w:rPr>
+      </w:pPr>
+      <w:r>
+        <w:rPr>
+          <w:rFonts w:ascii="Times New Roman" w:hAnsi="Times New Roman" w:cs="Times New Roman"/>
+          <w:b/>
+          <w:bCs/>
+        </w:rPr>
+        <w:t>22 – Đặt Addon Service</w:t>
+      </w:r>
+      <w:r>
+        <w:rPr>
+          <w:rFonts w:ascii="Times New Roman" w:hAnsi="Times New Roman" w:cs="Times New Roman"/>
+        </w:rPr>
+        <w:t> (giao diện chọn dịch vụ, kiểm tra lịch hoạt động, đặt chỗ)</w:t>
+      </w:r>
+    </w:p>
+    <w:p>
+      <w:pPr>
+        <w:numPr>
+          <w:ilvl w:val="0"/>
+          <w:numId w:val="8"/>
+        </w:numPr>
+        <w:spacing w:line="360" w:lineRule="auto"/>
+        <w:rPr>
+          <w:rFonts w:ascii="Times New Roman" w:hAnsi="Times New Roman" w:cs="Times New Roman"/>
+        </w:rPr>
+      </w:pPr>
+      <w:r>
+        <w:rPr>
+          <w:rFonts w:ascii="Times New Roman" w:hAnsi="Times New Roman" w:cs="Times New Roman"/>
+          <w:b/>
+          <w:bCs/>
+        </w:rPr>
+        <w:t>23 – Quản lý Service Types &amp; Services</w:t>
+      </w:r>
+      <w:r>
+        <w:rPr>
+          <w:rFonts w:ascii="Times New Roman" w:hAnsi="Times New Roman" w:cs="Times New Roman"/>
+        </w:rPr>
+        <w:t> (Admin CRUD dịch vụ)</w:t>
+      </w:r>
+    </w:p>
+    <w:p>
+      <w:pPr>
+        <w:numPr>
+          <w:ilvl w:val="0"/>
+          <w:numId w:val="8"/>
+        </w:numPr>
+        <w:spacing w:line="360" w:lineRule="auto"/>
+        <w:rPr>
+          <w:rFonts w:ascii="Times New Roman" w:hAnsi="Times New Roman" w:cs="Times New Roman"/>
+        </w:rPr>
+      </w:pPr>
+      <w:r>
+        <w:rPr>
+          <w:rFonts w:ascii="Times New Roman" w:hAnsi="Times New Roman" w:cs="Times New Roman"/>
+          <w:b/>
+          <w:bCs/>
+        </w:rPr>
+        <w:t>25 – Viết đánh giá</w:t>
+      </w:r>
+      <w:r>
+        <w:rPr>
+          <w:rFonts w:ascii="Times New Roman" w:hAnsi="Times New Roman" w:cs="Times New Roman"/>
+        </w:rPr>
+        <w:t> (sau khi Completed, gửi review cho item và host)</w:t>
+      </w:r>
+    </w:p>
+    <w:p>
+      <w:pPr>
+        <w:numPr>
+          <w:ilvl w:val="0"/>
+          <w:numId w:val="8"/>
+        </w:numPr>
+        <w:spacing w:line="360" w:lineRule="auto"/>
+        <w:rPr>
+          <w:rFonts w:ascii="Times New Roman" w:hAnsi="Times New Roman" w:cs="Times New Roman"/>
+        </w:rPr>
+      </w:pPr>
+      <w:r>
+        <w:rPr>
+          <w:rFonts w:ascii="Times New Roman" w:hAnsi="Times New Roman" w:cs="Times New Roman"/>
+          <w:b/>
+          <w:bCs/>
+        </w:rPr>
+        <w:t>26 – Xem đánh giá, điểm trung bình</w:t>
+      </w:r>
+      <w:r>
+        <w:rPr>
+          <w:rFonts w:ascii="Times New Roman" w:hAnsi="Times New Roman" w:cs="Times New Roman"/>
+        </w:rPr>
+        <w:t> (trang chi tiết listing có danh sách review, biểu đồ điểm tiêu chí)</w:t>
+      </w:r>
+    </w:p>
+    <w:p>
+      <w:pPr>
+        <w:numPr>
+          <w:ilvl w:val="0"/>
+          <w:numId w:val="8"/>
+        </w:numPr>
+        <w:spacing w:line="360" w:lineRule="auto"/>
+        <w:rPr>
+          <w:rFonts w:ascii="Times New Roman" w:hAnsi="Times New Roman" w:cs="Times New Roman"/>
+        </w:rPr>
+      </w:pPr>
+      <w:r>
+        <w:rPr>
+          <w:rFonts w:ascii="Times New Roman" w:hAnsi="Times New Roman" w:cs="Times New Roman"/>
+          <w:b/>
+          <w:bCs/>
+        </w:rPr>
+        <w:t>27 – Ẩn đánh giá vi phạm</w:t>
+      </w:r>
+      <w:r>
+        <w:rPr>
+          <w:rFonts w:ascii="Times New Roman" w:hAnsi="Times New Roman" w:cs="Times New Roman"/>
+        </w:rPr>
+        <w:t> (Admin)</w:t>
+      </w:r>
+    </w:p>
+    <w:p>
+      <w:pPr>
+        <w:numPr>
+          <w:ilvl w:val="0"/>
+          <w:numId w:val="8"/>
+        </w:numPr>
+        <w:spacing w:line="360" w:lineRule="auto"/>
+        <w:rPr>
+          <w:rFonts w:ascii="Times New Roman" w:hAnsi="Times New Roman" w:cs="Times New Roman"/>
+        </w:rPr>
+      </w:pPr>
+      <w:r>
+        <w:rPr>
+          <w:rFonts w:ascii="Times New Roman" w:hAnsi="Times New Roman" w:cs="Times New Roman"/>
+          <w:b/>
+          <w:bCs/>
+        </w:rPr>
+        <w:t>30 – Điểm loyalty tự động</w:t>
+      </w:r>
+      <w:r>
+        <w:rPr>
+          <w:rFonts w:ascii="Times New Roman" w:hAnsi="Times New Roman" w:cs="Times New Roman"/>
+        </w:rPr>
+        <w:t> (trigger/scheduler cộng điểm khi booking Completed)</w:t>
+      </w:r>
+    </w:p>
+    <w:p>
+      <w:pPr>
+        <w:spacing w:line="360" w:lineRule="auto"/>
+        <w:rPr>
+          <w:rFonts w:ascii="Times New Roman" w:hAnsi="Times New Roman" w:cs="Times New Roman"/>
+        </w:rPr>
+      </w:pPr>
+      <w:r>
+        <w:rPr>
+          <w:rFonts w:ascii="Times New Roman" w:hAnsi="Times New Roman" w:cs="Times New Roman"/>
+          <w:b/>
+          <w:bCs/>
+        </w:rPr>
+        <w:t>Kết quả:</w:t>
+      </w:r>
+      <w:r>
+        <w:rPr>
+          <w:rFonts w:ascii="Times New Roman" w:hAnsi="Times New Roman" w:cs="Times New Roman"/>
+        </w:rPr>
+        <w:t> Nền tảng có thêm dịch vụ gia tăng và hệ thống phản hồi chất lượng.</w:t>
+      </w:r>
+    </w:p>
+    <w:p>
+      <w:pPr>
+        <w:spacing w:line="360" w:lineRule="auto"/>
+        <w:rPr>
+          <w:rFonts w:ascii="Times New Roman" w:hAnsi="Times New Roman" w:cs="Times New Roman"/>
+        </w:rPr>
+      </w:pPr>
+      <w:r>
+        <w:rPr>
+          <w:rFonts w:ascii="Times New Roman" w:hAnsi="Times New Roman" w:cs="Times New Roman"/>
+        </w:rPr>
+        <w:pict w14:anchorId="3CD90921">
+          <v:rect id="_x0000_i1051" style="width:0;height:.75pt" o:hralign="center" o:hrstd="t" o:hr="t" fillcolor="#a0a0a0" stroked="f"/>
+        </w:pict>
+      </w:r>
+    </w:p>
+    <w:p>
+      <w:pPr>
+        <w:spacing w:line="360" w:lineRule="auto"/>
+        <w:rPr>
+          <w:rFonts w:ascii="Times New Roman" w:hAnsi="Times New Roman" w:cs="Times New Roman"/>
+          <w:b/>
+          <w:bCs/>
+        </w:rPr>
+      </w:pPr>
+      <w:r>
+        <w:rPr>
+          <w:rFonts w:ascii="Segoe UI Emoji" w:hAnsi="Segoe UI Emoji" w:cs="Segoe UI Emoji"/>
+          <w:b/>
+          <w:bCs/>
+        </w:rPr>
+        <w:t>📦</w:t>
+      </w:r>
+      <w:r>
+        <w:rPr>
+          <w:rFonts w:ascii="Times New Roman" w:hAnsi="Times New Roman" w:cs="Times New Roman"/>
+          <w:b/>
+          <w:bCs/>
+        </w:rPr>
+        <w:t xml:space="preserve"> Giai đoạn 4 – Báo cáo và Dashboard quản trị (Tuần 7 – 8)</w:t>
+      </w:r>
+    </w:p>
+    <w:p>
+      <w:pPr>
+        <w:spacing w:line="360" w:lineRule="auto"/>
+        <w:rPr>
+          <w:rFonts w:ascii="Times New Roman" w:hAnsi="Times New Roman" w:cs="Times New Roman"/>
+        </w:rPr>
+      </w:pPr>
+      <w:r>
+        <w:rPr>
+          <w:rFonts w:ascii="Times New Roman" w:hAnsi="Times New Roman" w:cs="Times New Roman"/>
+          <w:b/>
+          <w:bCs/>
+        </w:rPr>
+        <w:t>Mục tiêu:</w:t>
+      </w:r>
+      <w:r>
+        <w:rPr>
+          <w:rFonts w:ascii="Times New Roman" w:hAnsi="Times New Roman" w:cs="Times New Roman"/>
+        </w:rPr>
+        <w:t> Hoàn thiện các báo cáo Module 3 theo đề thi, phục vụ Regional Manager.</w:t>
+      </w:r>
+    </w:p>
+    <w:p>
+      <w:pPr>
+        <w:numPr>
+          <w:ilvl w:val="0"/>
+          <w:numId w:val="9"/>
+        </w:numPr>
+        <w:spacing w:line="360" w:lineRule="auto"/>
+        <w:rPr>
+          <w:rFonts w:ascii="Times New Roman" w:hAnsi="Times New Roman" w:cs="Times New Roman"/>
+        </w:rPr>
+      </w:pPr>
+      <w:r>
+        <w:rPr>
+          <w:rFonts w:ascii="Times New Roman" w:hAnsi="Times New Roman" w:cs="Times New Roman"/>
+          <w:b/>
+          <w:bCs/>
+        </w:rPr>
+        <w:t>35 – Thống kê User</w:t>
+      </w:r>
+      <w:r>
+        <w:rPr>
+          <w:rFonts w:ascii="Times New Roman" w:hAnsi="Times New Roman" w:cs="Times New Roman"/>
+        </w:rPr>
+        <w:t> (số guest, host, active, mới theo tháng)</w:t>
+      </w:r>
+    </w:p>
+    <w:p>
+      <w:pPr>
+        <w:numPr>
+          <w:ilvl w:val="0"/>
+          <w:numId w:val="9"/>
+        </w:numPr>
+        <w:spacing w:line="360" w:lineRule="auto"/>
+        <w:rPr>
+          <w:rFonts w:ascii="Times New Roman" w:hAnsi="Times New Roman" w:cs="Times New Roman"/>
+        </w:rPr>
+      </w:pPr>
+      <w:r>
+        <w:rPr>
+          <w:rFonts w:ascii="Times New Roman" w:hAnsi="Times New Roman" w:cs="Times New Roman"/>
+          <w:b/>
+          <w:bCs/>
+        </w:rPr>
+        <w:t>36 – Thống kê Booking</w:t>
+      </w:r>
+      <w:r>
+        <w:rPr>
+          <w:rFonts w:ascii="Times New Roman" w:hAnsi="Times New Roman" w:cs="Times New Roman"/>
+        </w:rPr>
+        <w:t> (secured, upcoming, vacancy ratio, most booked day…)</w:t>
+      </w:r>
+    </w:p>
+    <w:p>
+      <w:pPr>
+        <w:numPr>
+          <w:ilvl w:val="0"/>
+          <w:numId w:val="9"/>
+        </w:numPr>
+        <w:spacing w:line="360" w:lineRule="auto"/>
+        <w:rPr>
+          <w:rFonts w:ascii="Times New Roman" w:hAnsi="Times New Roman" w:cs="Times New Roman"/>
+        </w:rPr>
+      </w:pPr>
+      <w:r>
+        <w:rPr>
+          <w:rFonts w:ascii="Times New Roman" w:hAnsi="Times New Roman" w:cs="Times New Roman"/>
+          <w:b/>
+          <w:bCs/>
+        </w:rPr>
+        <w:t>37 – Hiệu suất Host</w:t>
+      </w:r>
+      <w:r>
+        <w:rPr>
+          <w:rFonts w:ascii="Times New Roman" w:hAnsi="Times New Roman" w:cs="Times New Roman"/>
+        </w:rPr>
+        <w:t> (danh sách host + chi tiết giao dịch)</w:t>
+      </w:r>
+    </w:p>
+    <w:p>
+      <w:pPr>
+        <w:numPr>
+          <w:ilvl w:val="0"/>
+          <w:numId w:val="9"/>
+        </w:numPr>
+        <w:spacing w:line="360" w:lineRule="auto"/>
+        <w:rPr>
+          <w:rFonts w:ascii="Times New Roman" w:hAnsi="Times New Roman" w:cs="Times New Roman"/>
+        </w:rPr>
+      </w:pPr>
+      <w:r>
+        <w:rPr>
+          <w:rFonts w:ascii="Times New Roman" w:hAnsi="Times New Roman" w:cs="Times New Roman"/>
+          <w:b/>
+          <w:bCs/>
+        </w:rPr>
+        <w:t>38 – Tổng quan Guest</w:t>
+      </w:r>
+      <w:r>
+        <w:rPr>
+          <w:rFonts w:ascii="Times New Roman" w:hAnsi="Times New Roman" w:cs="Times New Roman"/>
+        </w:rPr>
+        <w:t> (tổng booking, chi tiêu, điểm loyalty)</w:t>
+      </w:r>
+    </w:p>
+    <w:p>
+      <w:pPr>
+        <w:numPr>
+          <w:ilvl w:val="0"/>
+          <w:numId w:val="9"/>
+        </w:numPr>
+        <w:spacing w:line="360" w:lineRule="auto"/>
+        <w:rPr>
+          <w:rFonts w:ascii="Times New Roman" w:hAnsi="Times New Roman" w:cs="Times New Roman"/>
+        </w:rPr>
+      </w:pPr>
+      <w:r>
+        <w:rPr>
+          <w:rFonts w:ascii="Times New Roman" w:hAnsi="Times New Roman" w:cs="Times New Roman"/>
+          <w:b/>
+          <w:bCs/>
+        </w:rPr>
+        <w:t>39 – Doanh thu theo khu vực</w:t>
+      </w:r>
+    </w:p>
+    <w:p>
+      <w:pPr>
+        <w:numPr>
+          <w:ilvl w:val="0"/>
+          <w:numId w:val="9"/>
+        </w:numPr>
+        <w:spacing w:line="360" w:lineRule="auto"/>
+        <w:rPr>
+          <w:rFonts w:ascii="Times New Roman" w:hAnsi="Times New Roman" w:cs="Times New Roman"/>
+        </w:rPr>
+      </w:pPr>
+      <w:r>
+        <w:rPr>
+          <w:rFonts w:ascii="Times New Roman" w:hAnsi="Times New Roman" w:cs="Times New Roman"/>
+          <w:b/>
+          <w:bCs/>
+        </w:rPr>
+        <w:lastRenderedPageBreak/>
+        <w:t>40 – Tỷ lệ hủy phòng &amp; Monthly Vacancy Chart</w:t>
+      </w:r>
+    </w:p>
+    <w:p>
+      <w:pPr>
+        <w:numPr>
+          <w:ilvl w:val="0"/>
+          <w:numId w:val="9"/>
+        </w:numPr>
+        <w:spacing w:line="360" w:lineRule="auto"/>
+        <w:rPr>
+          <w:rFonts w:ascii="Times New Roman" w:hAnsi="Times New Roman" w:cs="Times New Roman"/>
+        </w:rPr>
+      </w:pPr>
+      <w:r>
+        <w:rPr>
+          <w:rFonts w:ascii="Times New Roman" w:hAnsi="Times New Roman" w:cs="Times New Roman"/>
+          <w:b/>
+          <w:bCs/>
+        </w:rPr>
+        <w:t>41 – Thống kê Coupon</w:t>
+      </w:r>
+      <w:r>
+        <w:rPr>
+          <w:rFonts w:ascii="Times New Roman" w:hAnsi="Times New Roman" w:cs="Times New Roman"/>
+        </w:rPr>
+        <w:t> (được dùng nhiều nhất, tổng giảm giá)</w:t>
+      </w:r>
+    </w:p>
+    <w:p>
+      <w:pPr>
+        <w:numPr>
+          <w:ilvl w:val="0"/>
+          <w:numId w:val="9"/>
+        </w:numPr>
+        <w:spacing w:line="360" w:lineRule="auto"/>
+        <w:rPr>
+          <w:rFonts w:ascii="Times New Roman" w:hAnsi="Times New Roman" w:cs="Times New Roman"/>
+        </w:rPr>
+      </w:pPr>
+      <w:r>
+        <w:rPr>
+          <w:rFonts w:ascii="Times New Roman" w:hAnsi="Times New Roman" w:cs="Times New Roman"/>
+          <w:b/>
+          <w:bCs/>
+        </w:rPr>
+        <w:t>24 – Service Report – heatmap dịch vụ theo tháng</w:t>
+      </w:r>
+      <w:r>
+        <w:rPr>
+          <w:rFonts w:ascii="Times New Roman" w:hAnsi="Times New Roman" w:cs="Times New Roman"/>
+        </w:rPr>
+        <w:t> (Module 3)</w:t>
+      </w:r>
+    </w:p>
+    <w:p>
+      <w:pPr>
+        <w:spacing w:line="360" w:lineRule="auto"/>
+        <w:rPr>
+          <w:rFonts w:ascii="Times New Roman" w:hAnsi="Times New Roman" w:cs="Times New Roman"/>
+        </w:rPr>
+      </w:pPr>
+      <w:r>
+        <w:rPr>
+          <w:rFonts w:ascii="Times New Roman" w:hAnsi="Times New Roman" w:cs="Times New Roman"/>
+          <w:b/>
+          <w:bCs/>
+        </w:rPr>
+        <w:t>Giao diện:</w:t>
+      </w:r>
+      <w:r>
+        <w:rPr>
+          <w:rFonts w:ascii="Times New Roman" w:hAnsi="Times New Roman" w:cs="Times New Roman"/>
+        </w:rPr>
+        <w:t> Hoàn thiện tab "Report" trong Form_Management hoặc tạo một form dashboard riêng với các filter (ngày, area, host, guest) và các biểu đồ.</w:t>
+      </w:r>
+    </w:p>
+    <w:p>
+      <w:pPr>
+        <w:spacing w:line="360" w:lineRule="auto"/>
+        <w:rPr>
+          <w:rFonts w:ascii="Times New Roman" w:hAnsi="Times New Roman" w:cs="Times New Roman"/>
+        </w:rPr>
+      </w:pPr>
+      <w:r>
+        <w:rPr>
+          <w:rFonts w:ascii="Times New Roman" w:hAnsi="Times New Roman" w:cs="Times New Roman"/>
+        </w:rPr>
+        <w:pict w14:anchorId="6D4000CA">
+          <v:rect id="_x0000_i1052" style="width:0;height:.75pt" o:hralign="center" o:hrstd="t" o:hr="t" fillcolor="#a0a0a0" stroked="f"/>
+        </w:pict>
+      </w:r>
+    </w:p>
+    <w:p>
+      <w:pPr>
+        <w:spacing w:line="360" w:lineRule="auto"/>
+        <w:rPr>
+          <w:rFonts w:ascii="Times New Roman" w:hAnsi="Times New Roman" w:cs="Times New Roman"/>
+          <w:b/>
+          <w:bCs/>
+        </w:rPr>
+      </w:pPr>
+      <w:r>
+        <w:rPr>
+          <w:rFonts w:ascii="Segoe UI Emoji" w:hAnsi="Segoe UI Emoji" w:cs="Segoe UI Emoji"/>
+          <w:b/>
+          <w:bCs/>
+        </w:rPr>
+        <w:t>📦</w:t>
+      </w:r>
+      <w:r>
+        <w:rPr>
+          <w:rFonts w:ascii="Times New Roman" w:hAnsi="Times New Roman" w:cs="Times New Roman"/>
+          <w:b/>
+          <w:bCs/>
+        </w:rPr>
+        <w:t xml:space="preserve"> Giai đoạn 5 – Quản trị hệ thống &amp; Kiểm thử hoàn chỉnh (Tuần 9 – 10)</w:t>
+      </w:r>
+    </w:p>
+    <w:p>
+      <w:pPr>
+        <w:spacing w:line="360" w:lineRule="auto"/>
+        <w:rPr>
+          <w:rFonts w:ascii="Times New Roman" w:hAnsi="Times New Roman" w:cs="Times New Roman"/>
+        </w:rPr>
+      </w:pPr>
+      <w:r>
+        <w:rPr>
+          <w:rFonts w:ascii="Times New Roman" w:hAnsi="Times New Roman" w:cs="Times New Roman"/>
+          <w:b/>
+          <w:bCs/>
+        </w:rPr>
+        <w:t>Mục tiêu:</w:t>
+      </w:r>
+      <w:r>
+        <w:rPr>
+          <w:rFonts w:ascii="Times New Roman" w:hAnsi="Times New Roman" w:cs="Times New Roman"/>
+        </w:rPr>
+        <w:t> Cho phép Admin quản lý toàn bộ danh mục và người dùng, viết unit test theo yêu cầu Module 1.</w:t>
+      </w:r>
+    </w:p>
+    <w:p>
+      <w:pPr>
+        <w:numPr>
+          <w:ilvl w:val="0"/>
+          <w:numId w:val="10"/>
+        </w:numPr>
+        <w:spacing w:line="360" w:lineRule="auto"/>
+        <w:rPr>
+          <w:rFonts w:ascii="Times New Roman" w:hAnsi="Times New Roman" w:cs="Times New Roman"/>
+        </w:rPr>
+      </w:pPr>
+      <w:r>
+        <w:rPr>
+          <w:rFonts w:ascii="Times New Roman" w:hAnsi="Times New Roman" w:cs="Times New Roman"/>
+          <w:b/>
+          <w:bCs/>
+        </w:rPr>
+        <w:t>06 – Duyệt / khóa Host</w:t>
+      </w:r>
+      <w:r>
+        <w:rPr>
+          <w:rFonts w:ascii="Times New Roman" w:hAnsi="Times New Roman" w:cs="Times New Roman"/>
+        </w:rPr>
+        <w:t> (Admin quản lý danh sách host, duyệt, khóa)</w:t>
+      </w:r>
+    </w:p>
+    <w:p>
+      <w:pPr>
+        <w:numPr>
+          <w:ilvl w:val="0"/>
+          <w:numId w:val="10"/>
+        </w:numPr>
+        <w:spacing w:line="360" w:lineRule="auto"/>
+        <w:rPr>
+          <w:rFonts w:ascii="Times New Roman" w:hAnsi="Times New Roman" w:cs="Times New Roman"/>
+        </w:rPr>
+      </w:pPr>
+      <w:r>
+        <w:rPr>
+          <w:rFonts w:ascii="Times New Roman" w:hAnsi="Times New Roman" w:cs="Times New Roman"/>
+          <w:b/>
+          <w:bCs/>
+        </w:rPr>
+        <w:t>07 – Quản lý Users CRUD</w:t>
+      </w:r>
+      <w:r>
+        <w:rPr>
+          <w:rFonts w:ascii="Times New Roman" w:hAnsi="Times New Roman" w:cs="Times New Roman"/>
+        </w:rPr>
+        <w:t> (Admin thêm/sửa/xóa user, phân quyền)</w:t>
+      </w:r>
+    </w:p>
+    <w:p>
+      <w:pPr>
+        <w:numPr>
+          <w:ilvl w:val="0"/>
+          <w:numId w:val="10"/>
+        </w:numPr>
+        <w:spacing w:line="360" w:lineRule="auto"/>
+        <w:rPr>
+          <w:rFonts w:ascii="Times New Roman" w:hAnsi="Times New Roman" w:cs="Times New Roman"/>
+        </w:rPr>
+      </w:pPr>
+      <w:r>
+        <w:rPr>
+          <w:rFonts w:ascii="Times New Roman" w:hAnsi="Times New Roman" w:cs="Times New Roman"/>
+          <w:b/>
+          <w:bCs/>
+        </w:rPr>
+        <w:t>31 – Quản lý Areas</w:t>
+      </w:r>
+      <w:r>
+        <w:rPr>
+          <w:rFonts w:ascii="Times New Roman" w:hAnsi="Times New Roman" w:cs="Times New Roman"/>
+        </w:rPr>
+        <w:t> (Admin CRUD khu vực)</w:t>
+      </w:r>
+    </w:p>
+    <w:p>
+      <w:pPr>
+        <w:numPr>
+          <w:ilvl w:val="0"/>
+          <w:numId w:val="10"/>
+        </w:numPr>
+        <w:spacing w:line="360" w:lineRule="auto"/>
+        <w:rPr>
+          <w:rFonts w:ascii="Times New Roman" w:hAnsi="Times New Roman" w:cs="Times New Roman"/>
+        </w:rPr>
+      </w:pPr>
+      <w:r>
+        <w:rPr>
+          <w:rFonts w:ascii="Times New Roman" w:hAnsi="Times New Roman" w:cs="Times New Roman"/>
+          <w:b/>
+          <w:bCs/>
+        </w:rPr>
+        <w:t>32 – Quản lý Attractions</w:t>
+      </w:r>
+      <w:r>
+        <w:rPr>
+          <w:rFonts w:ascii="Times New Roman" w:hAnsi="Times New Roman" w:cs="Times New Roman"/>
+        </w:rPr>
+        <w:t> (Admin CRUD điểm tham quan)</w:t>
+      </w:r>
+    </w:p>
+    <w:p>
+      <w:pPr>
+        <w:numPr>
+          <w:ilvl w:val="0"/>
+          <w:numId w:val="10"/>
+        </w:numPr>
+        <w:spacing w:line="360" w:lineRule="auto"/>
+        <w:rPr>
+          <w:rFonts w:ascii="Times New Roman" w:hAnsi="Times New Roman" w:cs="Times New Roman"/>
+        </w:rPr>
+      </w:pPr>
+      <w:r>
+        <w:rPr>
+          <w:rFonts w:ascii="Times New Roman" w:hAnsi="Times New Roman" w:cs="Times New Roman"/>
+          <w:b/>
+          <w:bCs/>
+        </w:rPr>
+        <w:t>33 – Quản lý Amenities</w:t>
+      </w:r>
+      <w:r>
+        <w:rPr>
+          <w:rFonts w:ascii="Times New Roman" w:hAnsi="Times New Roman" w:cs="Times New Roman"/>
+        </w:rPr>
+        <w:t> (Admin CRUD tiện nghi)</w:t>
+      </w:r>
+    </w:p>
+    <w:p>
+      <w:pPr>
+        <w:numPr>
+          <w:ilvl w:val="0"/>
+          <w:numId w:val="10"/>
+        </w:numPr>
+        <w:spacing w:line="360" w:lineRule="auto"/>
+        <w:rPr>
+          <w:rFonts w:ascii="Times New Roman" w:hAnsi="Times New Roman" w:cs="Times New Roman"/>
+        </w:rPr>
+      </w:pPr>
+      <w:r>
+        <w:rPr>
+          <w:rFonts w:ascii="Times New Roman" w:hAnsi="Times New Roman" w:cs="Times New Roman"/>
+          <w:b/>
+          <w:bCs/>
+        </w:rPr>
+        <w:t>34 – Loại phòng &amp; Loại giao dịch</w:t>
+      </w:r>
+      <w:r>
+        <w:rPr>
+          <w:rFonts w:ascii="Times New Roman" w:hAnsi="Times New Roman" w:cs="Times New Roman"/>
+        </w:rPr>
+        <w:t> (Admin CRUD ItemTypes, TransactionTypes)</w:t>
+      </w:r>
+    </w:p>
+    <w:p>
+      <w:pPr>
+        <w:numPr>
+          <w:ilvl w:val="0"/>
+          <w:numId w:val="10"/>
+        </w:numPr>
+        <w:spacing w:line="360" w:lineRule="auto"/>
+        <w:rPr>
+          <w:rFonts w:ascii="Times New Roman" w:hAnsi="Times New Roman" w:cs="Times New Roman"/>
+        </w:rPr>
+      </w:pPr>
+      <w:r>
+        <w:rPr>
+          <w:rFonts w:ascii="Times New Roman" w:hAnsi="Times New Roman" w:cs="Times New Roman"/>
+          <w:b/>
+          <w:bCs/>
+        </w:rPr>
+        <w:t>Đồng bộ hóa và tối ưu:</w:t>
+      </w:r>
+      <w:r>
+        <w:rPr>
+          <w:rFonts w:ascii="Times New Roman" w:hAnsi="Times New Roman" w:cs="Times New Roman"/>
+        </w:rPr>
+        <w:t> Kiểm tra lại toàn bộ các bảng có dữ liệu mẫu, sửa lỗi kết nối, transaction.</w:t>
+      </w:r>
+    </w:p>
+    <w:p>
+      <w:pPr>
+        <w:numPr>
+          <w:ilvl w:val="0"/>
+          <w:numId w:val="10"/>
+        </w:numPr>
+        <w:spacing w:line="360" w:lineRule="auto"/>
+        <w:rPr>
+          <w:rFonts w:ascii="Times New Roman" w:hAnsi="Times New Roman" w:cs="Times New Roman"/>
+        </w:rPr>
+      </w:pPr>
+      <w:r>
+        <w:rPr>
+          <w:rFonts w:ascii="Times New Roman" w:hAnsi="Times New Roman" w:cs="Times New Roman"/>
+          <w:b/>
+          <w:bCs/>
+        </w:rPr>
+        <w:t>Viết unit test</w:t>
+      </w:r>
+      <w:r>
+        <w:rPr>
+          <w:rFonts w:ascii="Times New Roman" w:hAnsi="Times New Roman" w:cs="Times New Roman"/>
+        </w:rPr>
+        <w:t> cho các phương thức đăng ký, đăng nhập, đặt phòng (theo yêu cầu Module 1). Có thể dùng NUnit hoặc MS Test.</w:t>
+      </w:r>
+    </w:p>
+    <w:p>
+      <w:pPr>
+        <w:numPr>
+          <w:ilvl w:val="0"/>
+          <w:numId w:val="10"/>
+        </w:numPr>
+        <w:spacing w:line="360" w:lineRule="auto"/>
+        <w:rPr>
+          <w:rFonts w:ascii="Times New Roman" w:hAnsi="Times New Roman" w:cs="Times New Roman"/>
+        </w:rPr>
+      </w:pPr>
+      <w:r>
+        <w:rPr>
+          <w:rFonts w:ascii="Times New Roman" w:hAnsi="Times New Roman" w:cs="Times New Roman"/>
+          <w:b/>
+          <w:bCs/>
+        </w:rPr>
+        <w:lastRenderedPageBreak/>
+        <w:t>Kiểm thử end</w:t>
+      </w:r>
+      <w:r>
+        <w:rPr>
+          <w:rFonts w:ascii="Times New Roman" w:hAnsi="Times New Roman" w:cs="Times New Roman"/>
+          <w:b/>
+          <w:bCs/>
+        </w:rPr>
+        <w:noBreakHyphen/>
+        <w:t>to</w:t>
+      </w:r>
+      <w:r>
+        <w:rPr>
+          <w:rFonts w:ascii="Times New Roman" w:hAnsi="Times New Roman" w:cs="Times New Roman"/>
+          <w:b/>
+          <w:bCs/>
+        </w:rPr>
+        <w:noBreakHyphen/>
+        <w:t>end</w:t>
+      </w:r>
+      <w:r>
+        <w:rPr>
+          <w:rFonts w:ascii="Times New Roman" w:hAnsi="Times New Roman" w:cs="Times New Roman"/>
+        </w:rPr>
+        <w:t> theo các kịch bản của Module 1 &amp; 3.</w:t>
+      </w:r>
+    </w:p>
+    <w:p>
+      <w:pPr>
+        <w:numPr>
+          <w:ilvl w:val="0"/>
+          <w:numId w:val="10"/>
+        </w:numPr>
+        <w:spacing w:line="360" w:lineRule="auto"/>
+        <w:rPr>
+          <w:rFonts w:ascii="Times New Roman" w:hAnsi="Times New Roman" w:cs="Times New Roman"/>
+        </w:rPr>
+      </w:pPr>
+      <w:r>
+        <w:rPr>
+          <w:rFonts w:ascii="Times New Roman" w:hAnsi="Times New Roman" w:cs="Times New Roman"/>
+          <w:b/>
+          <w:bCs/>
+        </w:rPr>
+        <w:t>Hoàn thiện tài liệu SRS</w:t>
+      </w:r>
+      <w:r>
+        <w:rPr>
+          <w:rFonts w:ascii="Times New Roman" w:hAnsi="Times New Roman" w:cs="Times New Roman"/>
+        </w:rPr>
+        <w:t> đã có.</w:t>
+      </w:r>
+    </w:p>
     <w:p>
       <w:pPr>
         <w:spacing w:line="360" w:lineRule="auto"/>
@@ -7212,6 +8689,155 @@
 <file path=word/numbering.xml><?xml version="1.0" encoding="utf-8"?>
 <w:numbering xmlns:wpc="http://schemas.microsoft.com/office/word/2010/wordprocessingCanvas" xmlns:cx="http://schemas.microsoft.com/office/drawing/2014/chartex" xmlns:cx1="http://schemas.microsoft.com/office/drawing/2015/9/8/chartex" xmlns:cx2="http://schemas.microsoft.com/office/drawing/2015/10/21/chartex" xmlns:cx3="http://schemas.microsoft.com/office/drawing/2016/5/9/chartex" xmlns:cx4="http://schemas.microsoft.com/office/drawing/2016/5/10/chartex" xmlns:cx5="http://schemas.microsoft.com/office/drawing/2016/5/11/chartex" xmlns:cx6="http://schemas.microsoft.com/office/drawing/2016/5/12/chartex" xmlns:cx7="http://schemas.microsoft.com/office/drawing/2016/5/13/chartex" xmlns:cx8="http://schemas.microsoft.com/office/drawing/2016/5/14/chartex" xmlns:mc="http://schemas.openxmlformats.org/markup-compatibility/2006" xmlns:aink="http://schemas.microsoft.com/office/drawing/2016/ink" xmlns:am3d="http://schemas.microsoft.com/office/drawing/2017/model3d" xmlns:o="urn:schemas-microsoft-com:office:office" xmlns:oel="http://schemas.microsoft.com/office/2019/extlst" xmlns:r="http://schemas.openxmlformats.org/officeDocument/2006/relationships" xmlns:m="http://schemas.openxmlformats.org/officeDocument/2006/math" xmlns:v="urn:schemas-microsoft-com:vml" xmlns:wp14="http://schemas.microsoft.com/office/word/2010/wordprocessingDrawing" xmlns:wp="http://schemas.openxmlformats.org/drawingml/2006/wordprocessingDrawing" xmlns:w10="urn:schemas-microsoft-com:office:word" xmlns:w="http://schemas.openxmlformats.org/wordprocessingml/2006/main" xmlns:w14="http://schemas.microsoft.com/office/word/2010/wordml" xmlns:w15="http://schemas.microsoft.com/office/word/2012/wordml" xmlns:w16cex="http://schemas.microsoft.com/office/word/2018/wordml/cex" xmlns:w16cid="http://schemas.microsoft.com/office/word/2016/wordml/cid" xmlns:w16="http://schemas.microsoft.com/office/word/2018/wordml" xmlns:w16du="http://schemas.microsoft.com/office/word/2023/wordml/word16du" xmlns:w16sdtdh="http://schemas.microsoft.com/office/word/2020/wordml/sdtdatahash" xmlns:w16sdtfl="http://schemas.microsoft.com/office/word/2024/wordml/sdtformatlock" xmlns:w16se="http://schemas.microsoft.com/office/word/2015/wordml/symex" xmlns:wpg="http://schemas.microsoft.com/office/word/2010/wordprocessingGroup" xmlns:wpi="http://schemas.microsoft.com/office/word/2010/wordprocessingInk" xmlns:wne="http://schemas.microsoft.com/office/word/2006/wordml" xmlns:wps="http://schemas.microsoft.com/office/word/2010/wordprocessingShape" mc:Ignorable="w14 w15 w16se w16cid w16 w16cex w16sdtdh w16sdtfl w16du wp14">
   <w:abstractNum w:abstractNumId="0" w15:restartNumberingAfterBreak="0">
+    <w:nsid w:val="0B3346E8"/>
+    <w:multiLevelType w:val="multilevel"/>
+    <w:tmpl w:val="ECBA4082"/>
+    <w:lvl w:ilvl="0">
+      <w:start w:val="1"/>
+      <w:numFmt w:val="bullet"/>
+      <w:lvlText w:val=""/>
+      <w:lvlJc w:val="left"/>
+      <w:pPr>
+        <w:tabs>
+          <w:tab w:val="num" w:pos="720"/>
+        </w:tabs>
+        <w:ind w:left="720" w:hanging="360"/>
+      </w:pPr>
+      <w:rPr>
+        <w:rFonts w:ascii="Symbol" w:hAnsi="Symbol" w:hint="default"/>
+        <w:sz w:val="20"/>
+      </w:rPr>
+    </w:lvl>
+    <w:lvl w:ilvl="1" w:tentative="1">
+      <w:start w:val="1"/>
+      <w:numFmt w:val="bullet"/>
+      <w:lvlText w:val="o"/>
+      <w:lvlJc w:val="left"/>
+      <w:pPr>
+        <w:tabs>
+          <w:tab w:val="num" w:pos="1440"/>
+        </w:tabs>
+        <w:ind w:left="1440" w:hanging="360"/>
+      </w:pPr>
+      <w:rPr>
+        <w:rFonts w:ascii="Courier New" w:hAnsi="Courier New" w:hint="default"/>
+        <w:sz w:val="20"/>
+      </w:rPr>
+    </w:lvl>
+    <w:lvl w:ilvl="2" w:tentative="1">
+      <w:start w:val="1"/>
+      <w:numFmt w:val="bullet"/>
+      <w:lvlText w:val=""/>
+      <w:lvlJc w:val="left"/>
+      <w:pPr>
+        <w:tabs>
+          <w:tab w:val="num" w:pos="2160"/>
+        </w:tabs>
+        <w:ind w:left="2160" w:hanging="360"/>
+      </w:pPr>
+      <w:rPr>
+        <w:rFonts w:ascii="Wingdings" w:hAnsi="Wingdings" w:hint="default"/>
+        <w:sz w:val="20"/>
+      </w:rPr>
+    </w:lvl>
+    <w:lvl w:ilvl="3" w:tentative="1">
+      <w:start w:val="1"/>
+      <w:numFmt w:val="bullet"/>
+      <w:lvlText w:val=""/>
+      <w:lvlJc w:val="left"/>
+      <w:pPr>
+        <w:tabs>
+          <w:tab w:val="num" w:pos="2880"/>
+        </w:tabs>
+        <w:ind w:left="2880" w:hanging="360"/>
+      </w:pPr>
+      <w:rPr>
+        <w:rFonts w:ascii="Wingdings" w:hAnsi="Wingdings" w:hint="default"/>
+        <w:sz w:val="20"/>
+      </w:rPr>
+    </w:lvl>
+    <w:lvl w:ilvl="4" w:tentative="1">
+      <w:start w:val="1"/>
+      <w:numFmt w:val="bullet"/>
+      <w:lvlText w:val=""/>
+      <w:lvlJc w:val="left"/>
+      <w:pPr>
+        <w:tabs>
+          <w:tab w:val="num" w:pos="3600"/>
+        </w:tabs>
+        <w:ind w:left="3600" w:hanging="360"/>
+      </w:pPr>
+      <w:rPr>
+        <w:rFonts w:ascii="Wingdings" w:hAnsi="Wingdings" w:hint="default"/>
+        <w:sz w:val="20"/>
+      </w:rPr>
+    </w:lvl>
+    <w:lvl w:ilvl="5" w:tentative="1">
+      <w:start w:val="1"/>
+      <w:numFmt w:val="bullet"/>
+      <w:lvlText w:val=""/>
+      <w:lvlJc w:val="left"/>
+      <w:pPr>
+        <w:tabs>
+          <w:tab w:val="num" w:pos="4320"/>
+        </w:tabs>
+        <w:ind w:left="4320" w:hanging="360"/>
+      </w:pPr>
+      <w:rPr>
+        <w:rFonts w:ascii="Wingdings" w:hAnsi="Wingdings" w:hint="default"/>
+        <w:sz w:val="20"/>
+      </w:rPr>
+    </w:lvl>
+    <w:lvl w:ilvl="6" w:tentative="1">
+      <w:start w:val="1"/>
+      <w:numFmt w:val="bullet"/>
+      <w:lvlText w:val=""/>
+      <w:lvlJc w:val="left"/>
+      <w:pPr>
+        <w:tabs>
+          <w:tab w:val="num" w:pos="5040"/>
+        </w:tabs>
+        <w:ind w:left="5040" w:hanging="360"/>
+      </w:pPr>
+      <w:rPr>
+        <w:rFonts w:ascii="Wingdings" w:hAnsi="Wingdings" w:hint="default"/>
+        <w:sz w:val="20"/>
+      </w:rPr>
+    </w:lvl>
+    <w:lvl w:ilvl="7" w:tentative="1">
+      <w:start w:val="1"/>
+      <w:numFmt w:val="bullet"/>
+      <w:lvlText w:val=""/>
+      <w:lvlJc w:val="left"/>
+      <w:pPr>
+        <w:tabs>
+          <w:tab w:val="num" w:pos="5760"/>
+        </w:tabs>
+        <w:ind w:left="5760" w:hanging="360"/>
+      </w:pPr>
+      <w:rPr>
+        <w:rFonts w:ascii="Wingdings" w:hAnsi="Wingdings" w:hint="default"/>
+        <w:sz w:val="20"/>
+      </w:rPr>
+    </w:lvl>
+    <w:lvl w:ilvl="8" w:tentative="1">
+      <w:start w:val="1"/>
+      <w:numFmt w:val="bullet"/>
+      <w:lvlText w:val=""/>
+      <w:lvlJc w:val="left"/>
+      <w:pPr>
+        <w:tabs>
+          <w:tab w:val="num" w:pos="6480"/>
+        </w:tabs>
+        <w:ind w:left="6480" w:hanging="360"/>
+      </w:pPr>
+      <w:rPr>
+        <w:rFonts w:ascii="Wingdings" w:hAnsi="Wingdings" w:hint="default"/>
+        <w:sz w:val="20"/>
+      </w:rPr>
+    </w:lvl>
+  </w:abstractNum>
+  <w:abstractNum w:abstractNumId="1" w15:restartNumberingAfterBreak="0">
     <w:nsid w:val="24D07C29"/>
     <w:multiLevelType w:val="hybridMultilevel"/>
     <w:tmpl w:val="3AE82D90"/>
@@ -7300,7 +8926,7 @@
       </w:pPr>
     </w:lvl>
   </w:abstractNum>
-  <w:abstractNum w:abstractNumId="1" w15:restartNumberingAfterBreak="0">
+  <w:abstractNum w:abstractNumId="2" w15:restartNumberingAfterBreak="0">
     <w:nsid w:val="2CDD559F"/>
     <w:multiLevelType w:val="hybridMultilevel"/>
     <w:tmpl w:val="88D61D68"/>
@@ -7389,7 +9015,156 @@
       </w:pPr>
     </w:lvl>
   </w:abstractNum>
-  <w:abstractNum w:abstractNumId="2" w15:restartNumberingAfterBreak="0">
+  <w:abstractNum w:abstractNumId="3" w15:restartNumberingAfterBreak="0">
+    <w:nsid w:val="38BA6DD8"/>
+    <w:multiLevelType w:val="multilevel"/>
+    <w:tmpl w:val="A91E7E22"/>
+    <w:lvl w:ilvl="0">
+      <w:start w:val="1"/>
+      <w:numFmt w:val="bullet"/>
+      <w:lvlText w:val=""/>
+      <w:lvlJc w:val="left"/>
+      <w:pPr>
+        <w:tabs>
+          <w:tab w:val="num" w:pos="720"/>
+        </w:tabs>
+        <w:ind w:left="720" w:hanging="360"/>
+      </w:pPr>
+      <w:rPr>
+        <w:rFonts w:ascii="Symbol" w:hAnsi="Symbol" w:hint="default"/>
+        <w:sz w:val="20"/>
+      </w:rPr>
+    </w:lvl>
+    <w:lvl w:ilvl="1" w:tentative="1">
+      <w:start w:val="1"/>
+      <w:numFmt w:val="bullet"/>
+      <w:lvlText w:val="o"/>
+      <w:lvlJc w:val="left"/>
+      <w:pPr>
+        <w:tabs>
+          <w:tab w:val="num" w:pos="1440"/>
+        </w:tabs>
+        <w:ind w:left="1440" w:hanging="360"/>
+      </w:pPr>
+      <w:rPr>
+        <w:rFonts w:ascii="Courier New" w:hAnsi="Courier New" w:hint="default"/>
+        <w:sz w:val="20"/>
+      </w:rPr>
+    </w:lvl>
+    <w:lvl w:ilvl="2" w:tentative="1">
+      <w:start w:val="1"/>
+      <w:numFmt w:val="bullet"/>
+      <w:lvlText w:val=""/>
+      <w:lvlJc w:val="left"/>
+      <w:pPr>
+        <w:tabs>
+          <w:tab w:val="num" w:pos="2160"/>
+        </w:tabs>
+        <w:ind w:left="2160" w:hanging="360"/>
+      </w:pPr>
+      <w:rPr>
+        <w:rFonts w:ascii="Wingdings" w:hAnsi="Wingdings" w:hint="default"/>
+        <w:sz w:val="20"/>
+      </w:rPr>
+    </w:lvl>
+    <w:lvl w:ilvl="3" w:tentative="1">
+      <w:start w:val="1"/>
+      <w:numFmt w:val="bullet"/>
+      <w:lvlText w:val=""/>
+      <w:lvlJc w:val="left"/>
+      <w:pPr>
+        <w:tabs>
+          <w:tab w:val="num" w:pos="2880"/>
+        </w:tabs>
+        <w:ind w:left="2880" w:hanging="360"/>
+      </w:pPr>
+      <w:rPr>
+        <w:rFonts w:ascii="Wingdings" w:hAnsi="Wingdings" w:hint="default"/>
+        <w:sz w:val="20"/>
+      </w:rPr>
+    </w:lvl>
+    <w:lvl w:ilvl="4" w:tentative="1">
+      <w:start w:val="1"/>
+      <w:numFmt w:val="bullet"/>
+      <w:lvlText w:val=""/>
+      <w:lvlJc w:val="left"/>
+      <w:pPr>
+        <w:tabs>
+          <w:tab w:val="num" w:pos="3600"/>
+        </w:tabs>
+        <w:ind w:left="3600" w:hanging="360"/>
+      </w:pPr>
+      <w:rPr>
+        <w:rFonts w:ascii="Wingdings" w:hAnsi="Wingdings" w:hint="default"/>
+        <w:sz w:val="20"/>
+      </w:rPr>
+    </w:lvl>
+    <w:lvl w:ilvl="5" w:tentative="1">
+      <w:start w:val="1"/>
+      <w:numFmt w:val="bullet"/>
+      <w:lvlText w:val=""/>
+      <w:lvlJc w:val="left"/>
+      <w:pPr>
+        <w:tabs>
+          <w:tab w:val="num" w:pos="4320"/>
+        </w:tabs>
+        <w:ind w:left="4320" w:hanging="360"/>
+      </w:pPr>
+      <w:rPr>
+        <w:rFonts w:ascii="Wingdings" w:hAnsi="Wingdings" w:hint="default"/>
+        <w:sz w:val="20"/>
+      </w:rPr>
+    </w:lvl>
+    <w:lvl w:ilvl="6" w:tentative="1">
+      <w:start w:val="1"/>
+      <w:numFmt w:val="bullet"/>
+      <w:lvlText w:val=""/>
+      <w:lvlJc w:val="left"/>
+      <w:pPr>
+        <w:tabs>
+          <w:tab w:val="num" w:pos="5040"/>
+        </w:tabs>
+        <w:ind w:left="5040" w:hanging="360"/>
+      </w:pPr>
+      <w:rPr>
+        <w:rFonts w:ascii="Wingdings" w:hAnsi="Wingdings" w:hint="default"/>
+        <w:sz w:val="20"/>
+      </w:rPr>
+    </w:lvl>
+    <w:lvl w:ilvl="7" w:tentative="1">
+      <w:start w:val="1"/>
+      <w:numFmt w:val="bullet"/>
+      <w:lvlText w:val=""/>
+      <w:lvlJc w:val="left"/>
+      <w:pPr>
+        <w:tabs>
+          <w:tab w:val="num" w:pos="5760"/>
+        </w:tabs>
+        <w:ind w:left="5760" w:hanging="360"/>
+      </w:pPr>
+      <w:rPr>
+        <w:rFonts w:ascii="Wingdings" w:hAnsi="Wingdings" w:hint="default"/>
+        <w:sz w:val="20"/>
+      </w:rPr>
+    </w:lvl>
+    <w:lvl w:ilvl="8" w:tentative="1">
+      <w:start w:val="1"/>
+      <w:numFmt w:val="bullet"/>
+      <w:lvlText w:val=""/>
+      <w:lvlJc w:val="left"/>
+      <w:pPr>
+        <w:tabs>
+          <w:tab w:val="num" w:pos="6480"/>
+        </w:tabs>
+        <w:ind w:left="6480" w:hanging="360"/>
+      </w:pPr>
+      <w:rPr>
+        <w:rFonts w:ascii="Wingdings" w:hAnsi="Wingdings" w:hint="default"/>
+        <w:sz w:val="20"/>
+      </w:rPr>
+    </w:lvl>
+  </w:abstractNum>
+  <w:abstractNum w:abstractNumId="4" w15:restartNumberingAfterBreak="0">
     <w:nsid w:val="40095FD6"/>
     <w:multiLevelType w:val="hybridMultilevel"/>
     <w:tmpl w:val="43AEE106"/>
@@ -7478,7 +9253,305 @@
       </w:pPr>
     </w:lvl>
   </w:abstractNum>
-  <w:abstractNum w:abstractNumId="3" w15:restartNumberingAfterBreak="0">
+  <w:abstractNum w:abstractNumId="5" w15:restartNumberingAfterBreak="0">
+    <w:nsid w:val="4D0A4111"/>
+    <w:multiLevelType w:val="multilevel"/>
+    <w:tmpl w:val="BC2ECD44"/>
+    <w:lvl w:ilvl="0">
+      <w:start w:val="1"/>
+      <w:numFmt w:val="bullet"/>
+      <w:lvlText w:val=""/>
+      <w:lvlJc w:val="left"/>
+      <w:pPr>
+        <w:tabs>
+          <w:tab w:val="num" w:pos="720"/>
+        </w:tabs>
+        <w:ind w:left="720" w:hanging="360"/>
+      </w:pPr>
+      <w:rPr>
+        <w:rFonts w:ascii="Symbol" w:hAnsi="Symbol" w:hint="default"/>
+        <w:sz w:val="20"/>
+      </w:rPr>
+    </w:lvl>
+    <w:lvl w:ilvl="1" w:tentative="1">
+      <w:start w:val="1"/>
+      <w:numFmt w:val="bullet"/>
+      <w:lvlText w:val="o"/>
+      <w:lvlJc w:val="left"/>
+      <w:pPr>
+        <w:tabs>
+          <w:tab w:val="num" w:pos="1440"/>
+        </w:tabs>
+        <w:ind w:left="1440" w:hanging="360"/>
+      </w:pPr>
+      <w:rPr>
+        <w:rFonts w:ascii="Courier New" w:hAnsi="Courier New" w:hint="default"/>
+        <w:sz w:val="20"/>
+      </w:rPr>
+    </w:lvl>
+    <w:lvl w:ilvl="2" w:tentative="1">
+      <w:start w:val="1"/>
+      <w:numFmt w:val="bullet"/>
+      <w:lvlText w:val=""/>
+      <w:lvlJc w:val="left"/>
+      <w:pPr>
+        <w:tabs>
+          <w:tab w:val="num" w:pos="2160"/>
+        </w:tabs>
+        <w:ind w:left="2160" w:hanging="360"/>
+      </w:pPr>
+      <w:rPr>
+        <w:rFonts w:ascii="Wingdings" w:hAnsi="Wingdings" w:hint="default"/>
+        <w:sz w:val="20"/>
+      </w:rPr>
+    </w:lvl>
+    <w:lvl w:ilvl="3" w:tentative="1">
+      <w:start w:val="1"/>
+      <w:numFmt w:val="bullet"/>
+      <w:lvlText w:val=""/>
+      <w:lvlJc w:val="left"/>
+      <w:pPr>
+        <w:tabs>
+          <w:tab w:val="num" w:pos="2880"/>
+        </w:tabs>
+        <w:ind w:left="2880" w:hanging="360"/>
+      </w:pPr>
+      <w:rPr>
+        <w:rFonts w:ascii="Wingdings" w:hAnsi="Wingdings" w:hint="default"/>
+        <w:sz w:val="20"/>
+      </w:rPr>
+    </w:lvl>
+    <w:lvl w:ilvl="4" w:tentative="1">
+      <w:start w:val="1"/>
+      <w:numFmt w:val="bullet"/>
+      <w:lvlText w:val=""/>
+      <w:lvlJc w:val="left"/>
+      <w:pPr>
+        <w:tabs>
+          <w:tab w:val="num" w:pos="3600"/>
+        </w:tabs>
+        <w:ind w:left="3600" w:hanging="360"/>
+      </w:pPr>
+      <w:rPr>
+        <w:rFonts w:ascii="Wingdings" w:hAnsi="Wingdings" w:hint="default"/>
+        <w:sz w:val="20"/>
+      </w:rPr>
+    </w:lvl>
+    <w:lvl w:ilvl="5" w:tentative="1">
+      <w:start w:val="1"/>
+      <w:numFmt w:val="bullet"/>
+      <w:lvlText w:val=""/>
+      <w:lvlJc w:val="left"/>
+      <w:pPr>
+        <w:tabs>
+          <w:tab w:val="num" w:pos="4320"/>
+        </w:tabs>
+        <w:ind w:left="4320" w:hanging="360"/>
+      </w:pPr>
+      <w:rPr>
+        <w:rFonts w:ascii="Wingdings" w:hAnsi="Wingdings" w:hint="default"/>
+        <w:sz w:val="20"/>
+      </w:rPr>
+    </w:lvl>
+    <w:lvl w:ilvl="6" w:tentative="1">
+      <w:start w:val="1"/>
+      <w:numFmt w:val="bullet"/>
+      <w:lvlText w:val=""/>
+      <w:lvlJc w:val="left"/>
+      <w:pPr>
+        <w:tabs>
+          <w:tab w:val="num" w:pos="5040"/>
+        </w:tabs>
+        <w:ind w:left="5040" w:hanging="360"/>
+      </w:pPr>
+      <w:rPr>
+        <w:rFonts w:ascii="Wingdings" w:hAnsi="Wingdings" w:hint="default"/>
+        <w:sz w:val="20"/>
+      </w:rPr>
+    </w:lvl>
+    <w:lvl w:ilvl="7" w:tentative="1">
+      <w:start w:val="1"/>
+      <w:numFmt w:val="bullet"/>
+      <w:lvlText w:val=""/>
+      <w:lvlJc w:val="left"/>
+      <w:pPr>
+        <w:tabs>
+          <w:tab w:val="num" w:pos="5760"/>
+        </w:tabs>
+        <w:ind w:left="5760" w:hanging="360"/>
+      </w:pPr>
+      <w:rPr>
+        <w:rFonts w:ascii="Wingdings" w:hAnsi="Wingdings" w:hint="default"/>
+        <w:sz w:val="20"/>
+      </w:rPr>
+    </w:lvl>
+    <w:lvl w:ilvl="8" w:tentative="1">
+      <w:start w:val="1"/>
+      <w:numFmt w:val="bullet"/>
+      <w:lvlText w:val=""/>
+      <w:lvlJc w:val="left"/>
+      <w:pPr>
+        <w:tabs>
+          <w:tab w:val="num" w:pos="6480"/>
+        </w:tabs>
+        <w:ind w:left="6480" w:hanging="360"/>
+      </w:pPr>
+      <w:rPr>
+        <w:rFonts w:ascii="Wingdings" w:hAnsi="Wingdings" w:hint="default"/>
+        <w:sz w:val="20"/>
+      </w:rPr>
+    </w:lvl>
+  </w:abstractNum>
+  <w:abstractNum w:abstractNumId="6" w15:restartNumberingAfterBreak="0">
+    <w:nsid w:val="51946043"/>
+    <w:multiLevelType w:val="multilevel"/>
+    <w:tmpl w:val="4A7E3486"/>
+    <w:lvl w:ilvl="0">
+      <w:start w:val="1"/>
+      <w:numFmt w:val="bullet"/>
+      <w:lvlText w:val=""/>
+      <w:lvlJc w:val="left"/>
+      <w:pPr>
+        <w:tabs>
+          <w:tab w:val="num" w:pos="720"/>
+        </w:tabs>
+        <w:ind w:left="720" w:hanging="360"/>
+      </w:pPr>
+      <w:rPr>
+        <w:rFonts w:ascii="Symbol" w:hAnsi="Symbol" w:hint="default"/>
+        <w:sz w:val="20"/>
+      </w:rPr>
+    </w:lvl>
+    <w:lvl w:ilvl="1" w:tentative="1">
+      <w:start w:val="1"/>
+      <w:numFmt w:val="bullet"/>
+      <w:lvlText w:val="o"/>
+      <w:lvlJc w:val="left"/>
+      <w:pPr>
+        <w:tabs>
+          <w:tab w:val="num" w:pos="1440"/>
+        </w:tabs>
+        <w:ind w:left="1440" w:hanging="360"/>
+      </w:pPr>
+      <w:rPr>
+        <w:rFonts w:ascii="Courier New" w:hAnsi="Courier New" w:hint="default"/>
+        <w:sz w:val="20"/>
+      </w:rPr>
+    </w:lvl>
+    <w:lvl w:ilvl="2" w:tentative="1">
+      <w:start w:val="1"/>
+      <w:numFmt w:val="bullet"/>
+      <w:lvlText w:val=""/>
+      <w:lvlJc w:val="left"/>
+      <w:pPr>
+        <w:tabs>
+          <w:tab w:val="num" w:pos="2160"/>
+        </w:tabs>
+        <w:ind w:left="2160" w:hanging="360"/>
+      </w:pPr>
+      <w:rPr>
+        <w:rFonts w:ascii="Wingdings" w:hAnsi="Wingdings" w:hint="default"/>
+        <w:sz w:val="20"/>
+      </w:rPr>
+    </w:lvl>
+    <w:lvl w:ilvl="3" w:tentative="1">
+      <w:start w:val="1"/>
+      <w:numFmt w:val="bullet"/>
+      <w:lvlText w:val=""/>
+      <w:lvlJc w:val="left"/>
+      <w:pPr>
+        <w:tabs>
+          <w:tab w:val="num" w:pos="2880"/>
+        </w:tabs>
+        <w:ind w:left="2880" w:hanging="360"/>
+      </w:pPr>
+      <w:rPr>
+        <w:rFonts w:ascii="Wingdings" w:hAnsi="Wingdings" w:hint="default"/>
+        <w:sz w:val="20"/>
+      </w:rPr>
+    </w:lvl>
+    <w:lvl w:ilvl="4" w:tentative="1">
+      <w:start w:val="1"/>
+      <w:numFmt w:val="bullet"/>
+      <w:lvlText w:val=""/>
+      <w:lvlJc w:val="left"/>
+      <w:pPr>
+        <w:tabs>
+          <w:tab w:val="num" w:pos="3600"/>
+        </w:tabs>
+        <w:ind w:left="3600" w:hanging="360"/>
+      </w:pPr>
+      <w:rPr>
+        <w:rFonts w:ascii="Wingdings" w:hAnsi="Wingdings" w:hint="default"/>
+        <w:sz w:val="20"/>
+      </w:rPr>
+    </w:lvl>
+    <w:lvl w:ilvl="5" w:tentative="1">
+      <w:start w:val="1"/>
+      <w:numFmt w:val="bullet"/>
+      <w:lvlText w:val=""/>
+      <w:lvlJc w:val="left"/>
+      <w:pPr>
+        <w:tabs>
+          <w:tab w:val="num" w:pos="4320"/>
+        </w:tabs>
+        <w:ind w:left="4320" w:hanging="360"/>
+      </w:pPr>
+      <w:rPr>
+        <w:rFonts w:ascii="Wingdings" w:hAnsi="Wingdings" w:hint="default"/>
+        <w:sz w:val="20"/>
+      </w:rPr>
+    </w:lvl>
+    <w:lvl w:ilvl="6" w:tentative="1">
+      <w:start w:val="1"/>
+      <w:numFmt w:val="bullet"/>
+      <w:lvlText w:val=""/>
+      <w:lvlJc w:val="left"/>
+      <w:pPr>
+        <w:tabs>
+          <w:tab w:val="num" w:pos="5040"/>
+        </w:tabs>
+        <w:ind w:left="5040" w:hanging="360"/>
+      </w:pPr>
+      <w:rPr>
+        <w:rFonts w:ascii="Wingdings" w:hAnsi="Wingdings" w:hint="default"/>
+        <w:sz w:val="20"/>
+      </w:rPr>
+    </w:lvl>
+    <w:lvl w:ilvl="7" w:tentative="1">
+      <w:start w:val="1"/>
+      <w:numFmt w:val="bullet"/>
+      <w:lvlText w:val=""/>
+      <w:lvlJc w:val="left"/>
+      <w:pPr>
+        <w:tabs>
+          <w:tab w:val="num" w:pos="5760"/>
+        </w:tabs>
+        <w:ind w:left="5760" w:hanging="360"/>
+      </w:pPr>
+      <w:rPr>
+        <w:rFonts w:ascii="Wingdings" w:hAnsi="Wingdings" w:hint="default"/>
+        <w:sz w:val="20"/>
+      </w:rPr>
+    </w:lvl>
+    <w:lvl w:ilvl="8" w:tentative="1">
+      <w:start w:val="1"/>
+      <w:numFmt w:val="bullet"/>
+      <w:lvlText w:val=""/>
+      <w:lvlJc w:val="left"/>
+      <w:pPr>
+        <w:tabs>
+          <w:tab w:val="num" w:pos="6480"/>
+        </w:tabs>
+        <w:ind w:left="6480" w:hanging="360"/>
+      </w:pPr>
+      <w:rPr>
+        <w:rFonts w:ascii="Wingdings" w:hAnsi="Wingdings" w:hint="default"/>
+        <w:sz w:val="20"/>
+      </w:rPr>
+    </w:lvl>
+  </w:abstractNum>
+  <w:abstractNum w:abstractNumId="7" w15:restartNumberingAfterBreak="0">
     <w:nsid w:val="5BD40B67"/>
     <w:multiLevelType w:val="hybridMultilevel"/>
     <w:tmpl w:val="7D0229B6"/>
@@ -7567,7 +9640,7 @@
       </w:pPr>
     </w:lvl>
   </w:abstractNum>
-  <w:abstractNum w:abstractNumId="4" w15:restartNumberingAfterBreak="0">
+  <w:abstractNum w:abstractNumId="8" w15:restartNumberingAfterBreak="0">
     <w:nsid w:val="724C252C"/>
     <w:multiLevelType w:val="hybridMultilevel"/>
     <w:tmpl w:val="89DE984A"/>
@@ -7653,20 +9726,184 @@
       </w:pPr>
     </w:lvl>
   </w:abstractNum>
+  <w:abstractNum w:abstractNumId="9" w15:restartNumberingAfterBreak="0">
+    <w:nsid w:val="73C21974"/>
+    <w:multiLevelType w:val="multilevel"/>
+    <w:tmpl w:val="633EE05C"/>
+    <w:lvl w:ilvl="0">
+      <w:start w:val="1"/>
+      <w:numFmt w:val="bullet"/>
+      <w:lvlText w:val=""/>
+      <w:lvlJc w:val="left"/>
+      <w:pPr>
+        <w:tabs>
+          <w:tab w:val="num" w:pos="720"/>
+        </w:tabs>
+        <w:ind w:left="720" w:hanging="360"/>
+      </w:pPr>
+      <w:rPr>
+        <w:rFonts w:ascii="Symbol" w:hAnsi="Symbol" w:hint="default"/>
+        <w:sz w:val="20"/>
+      </w:rPr>
+    </w:lvl>
+    <w:lvl w:ilvl="1" w:tentative="1">
+      <w:start w:val="1"/>
+      <w:numFmt w:val="bullet"/>
+      <w:lvlText w:val="o"/>
+      <w:lvlJc w:val="left"/>
+      <w:pPr>
+        <w:tabs>
+          <w:tab w:val="num" w:pos="1440"/>
+        </w:tabs>
+        <w:ind w:left="1440" w:hanging="360"/>
+      </w:pPr>
+      <w:rPr>
+        <w:rFonts w:ascii="Courier New" w:hAnsi="Courier New" w:hint="default"/>
+        <w:sz w:val="20"/>
+      </w:rPr>
+    </w:lvl>
+    <w:lvl w:ilvl="2" w:tentative="1">
+      <w:start w:val="1"/>
+      <w:numFmt w:val="bullet"/>
+      <w:lvlText w:val=""/>
+      <w:lvlJc w:val="left"/>
+      <w:pPr>
+        <w:tabs>
+          <w:tab w:val="num" w:pos="2160"/>
+        </w:tabs>
+        <w:ind w:left="2160" w:hanging="360"/>
+      </w:pPr>
+      <w:rPr>
+        <w:rFonts w:ascii="Wingdings" w:hAnsi="Wingdings" w:hint="default"/>
+        <w:sz w:val="20"/>
+      </w:rPr>
+    </w:lvl>
+    <w:lvl w:ilvl="3" w:tentative="1">
+      <w:start w:val="1"/>
+      <w:numFmt w:val="bullet"/>
+      <w:lvlText w:val=""/>
+      <w:lvlJc w:val="left"/>
+      <w:pPr>
+        <w:tabs>
+          <w:tab w:val="num" w:pos="2880"/>
+        </w:tabs>
+        <w:ind w:left="2880" w:hanging="360"/>
+      </w:pPr>
+      <w:rPr>
+        <w:rFonts w:ascii="Wingdings" w:hAnsi="Wingdings" w:hint="default"/>
+        <w:sz w:val="20"/>
+      </w:rPr>
+    </w:lvl>
+    <w:lvl w:ilvl="4" w:tentative="1">
+      <w:start w:val="1"/>
+      <w:numFmt w:val="bullet"/>
+      <w:lvlText w:val=""/>
+      <w:lvlJc w:val="left"/>
+      <w:pPr>
+        <w:tabs>
+          <w:tab w:val="num" w:pos="3600"/>
+        </w:tabs>
+        <w:ind w:left="3600" w:hanging="360"/>
+      </w:pPr>
+      <w:rPr>
+        <w:rFonts w:ascii="Wingdings" w:hAnsi="Wingdings" w:hint="default"/>
+        <w:sz w:val="20"/>
+      </w:rPr>
+    </w:lvl>
+    <w:lvl w:ilvl="5" w:tentative="1">
+      <w:start w:val="1"/>
+      <w:numFmt w:val="bullet"/>
+      <w:lvlText w:val=""/>
+      <w:lvlJc w:val="left"/>
+      <w:pPr>
+        <w:tabs>
+          <w:tab w:val="num" w:pos="4320"/>
+        </w:tabs>
+        <w:ind w:left="4320" w:hanging="360"/>
+      </w:pPr>
+      <w:rPr>
+        <w:rFonts w:ascii="Wingdings" w:hAnsi="Wingdings" w:hint="default"/>
+        <w:sz w:val="20"/>
+      </w:rPr>
+    </w:lvl>
+    <w:lvl w:ilvl="6" w:tentative="1">
+      <w:start w:val="1"/>
+      <w:numFmt w:val="bullet"/>
+      <w:lvlText w:val=""/>
+      <w:lvlJc w:val="left"/>
+      <w:pPr>
+        <w:tabs>
+          <w:tab w:val="num" w:pos="5040"/>
+        </w:tabs>
+        <w:ind w:left="5040" w:hanging="360"/>
+      </w:pPr>
+      <w:rPr>
+        <w:rFonts w:ascii="Wingdings" w:hAnsi="Wingdings" w:hint="default"/>
+        <w:sz w:val="20"/>
+      </w:rPr>
+    </w:lvl>
+    <w:lvl w:ilvl="7" w:tentative="1">
+      <w:start w:val="1"/>
+      <w:numFmt w:val="bullet"/>
+      <w:lvlText w:val=""/>
+      <w:lvlJc w:val="left"/>
+      <w:pPr>
+        <w:tabs>
+          <w:tab w:val="num" w:pos="5760"/>
+        </w:tabs>
+        <w:ind w:left="5760" w:hanging="360"/>
+      </w:pPr>
+      <w:rPr>
+        <w:rFonts w:ascii="Wingdings" w:hAnsi="Wingdings" w:hint="default"/>
+        <w:sz w:val="20"/>
+      </w:rPr>
+    </w:lvl>
+    <w:lvl w:ilvl="8" w:tentative="1">
+      <w:start w:val="1"/>
+      <w:numFmt w:val="bullet"/>
+      <w:lvlText w:val=""/>
+      <w:lvlJc w:val="left"/>
+      <w:pPr>
+        <w:tabs>
+          <w:tab w:val="num" w:pos="6480"/>
+        </w:tabs>
+        <w:ind w:left="6480" w:hanging="360"/>
+      </w:pPr>
+      <w:rPr>
+        <w:rFonts w:ascii="Wingdings" w:hAnsi="Wingdings" w:hint="default"/>
+        <w:sz w:val="20"/>
+      </w:rPr>
+    </w:lvl>
+  </w:abstractNum>
   <w:num w:numId="1" w16cid:durableId="174928145">
+    <w:abstractNumId w:val="1"/>
+  </w:num>
+  <w:num w:numId="2" w16cid:durableId="108741933">
+    <w:abstractNumId w:val="4"/>
+  </w:num>
+  <w:num w:numId="3" w16cid:durableId="216400663">
+    <w:abstractNumId w:val="2"/>
+  </w:num>
+  <w:num w:numId="4" w16cid:durableId="1737433633">
+    <w:abstractNumId w:val="8"/>
+  </w:num>
+  <w:num w:numId="5" w16cid:durableId="1236168184">
+    <w:abstractNumId w:val="7"/>
+  </w:num>
+  <w:num w:numId="6" w16cid:durableId="1701204910">
+    <w:abstractNumId w:val="9"/>
+  </w:num>
+  <w:num w:numId="7" w16cid:durableId="127746066">
     <w:abstractNumId w:val="0"/>
   </w:num>
-  <w:num w:numId="2" w16cid:durableId="108741933">
-    <w:abstractNumId w:val="2"/>
+  <w:num w:numId="8" w16cid:durableId="772477114">
+    <w:abstractNumId w:val="3"/>
   </w:num>
-  <w:num w:numId="3" w16cid:durableId="216400663">
-    <w:abstractNumId w:val="1"/>
+  <w:num w:numId="9" w16cid:durableId="827936167">
+    <w:abstractNumId w:val="6"/>
   </w:num>
-  <w:num w:numId="4" w16cid:durableId="1737433633">
-    <w:abstractNumId w:val="4"/>
-  </w:num>
-  <w:num w:numId="5" w16cid:durableId="1236168184">
-    <w:abstractNumId w:val="3"/>
+  <w:num w:numId="10" w16cid:durableId="771238977">
+    <w:abstractNumId w:val="5"/>
   </w:num>
 </w:numbering>
 </file>
@@ -8273,7 +10510,6 @@
   <w:style w:type="character" w:default="1" w:styleId="DefaultParagraphFont">
     <w:name w:val="Default Paragraph Font"/>
     <w:uiPriority w:val="1"/>
-    <w:semiHidden/>
     <w:unhideWhenUsed/>
   </w:style>
   <w:style w:type="table" w:default="1" w:styleId="TableNormal">

</xml_diff>

<commit_message>
add feature User Live Search Items
</commit_message>
<xml_diff>
--- a/documents/New Microsoft Word Document.docx
+++ b/documents/New Microsoft Word Document.docx
@@ -826,11 +826,13 @@
         <w:spacing w:line="360" w:lineRule="auto"/>
         <w:rPr>
           <w:rFonts w:ascii="Times New Roman" w:hAnsi="Times New Roman" w:cs="Times New Roman"/>
-        </w:rPr>
-      </w:pPr>
-      <w:r>
-        <w:rPr>
-          <w:rFonts w:ascii="Times New Roman" w:hAnsi="Times New Roman" w:cs="Times New Roman"/>
+          <w:strike/>
+        </w:rPr>
+      </w:pPr>
+      <w:r>
+        <w:rPr>
+          <w:rFonts w:ascii="Times New Roman" w:hAnsi="Times New Roman" w:cs="Times New Roman"/>
+          <w:strike/>
         </w:rPr>
         <w:t>frmLogin: Đăng nhập User / Employee, keep signed in, show password | XtraForm</w:t>
       </w:r>
@@ -845,11 +847,13 @@
         <w:spacing w:line="360" w:lineRule="auto"/>
         <w:rPr>
           <w:rFonts w:ascii="Times New Roman" w:hAnsi="Times New Roman" w:cs="Times New Roman"/>
-        </w:rPr>
-      </w:pPr>
-      <w:r>
-        <w:rPr>
-          <w:rFonts w:ascii="Times New Roman" w:hAnsi="Times New Roman" w:cs="Times New Roman"/>
+          <w:strike/>
+        </w:rPr>
+      </w:pPr>
+      <w:r>
+        <w:rPr>
+          <w:rFonts w:ascii="Times New Roman" w:hAnsi="Times New Roman" w:cs="Times New Roman"/>
+          <w:strike/>
         </w:rPr>
         <w:t>frmRegister: Đăng ký tài khoản, xem điều khoản, validate password | XtraForm</w:t>
       </w:r>
@@ -897,11 +901,13 @@
         <w:spacing w:line="360" w:lineRule="auto"/>
         <w:rPr>
           <w:rFonts w:ascii="Times New Roman" w:hAnsi="Times New Roman" w:cs="Times New Roman"/>
-        </w:rPr>
-      </w:pPr>
-      <w:r>
-        <w:rPr>
-          <w:rFonts w:ascii="Times New Roman" w:hAnsi="Times New Roman" w:cs="Times New Roman"/>
+          <w:strike/>
+        </w:rPr>
+      </w:pPr>
+      <w:r>
+        <w:rPr>
+          <w:rFonts w:ascii="Times New Roman" w:hAnsi="Times New Roman" w:cs="Times New Roman"/>
+          <w:strike/>
         </w:rPr>
         <w:t xml:space="preserve">frmAddEditListing Thêm / Sửa chỗ ở — XtraTabControl 3 tab: Listing Details · Amenities · Distance to Attraction. </w:t>
       </w:r>
@@ -909,6 +915,7 @@
       <w:r>
         <w:rPr>
           <w:rFonts w:ascii="Times New Roman" w:hAnsi="Times New Roman" w:cs="Times New Roman"/>
+          <w:strike/>
         </w:rPr>
         <w:t>Nút</w:t>
       </w:r>
@@ -916,6 +923,7 @@
       <w:r>
         <w:rPr>
           <w:rFonts w:ascii="Times New Roman" w:hAnsi="Times New Roman" w:cs="Times New Roman"/>
+          <w:strike/>
         </w:rPr>
         <w:t xml:space="preserve"> Next/Cancel (Add mode) hoặc Close (Edit mode). Chứa 3 UC nội </w:t>
       </w:r>
@@ -923,6 +931,7 @@
       <w:r>
         <w:rPr>
           <w:rFonts w:ascii="Times New Roman" w:hAnsi="Times New Roman" w:cs="Times New Roman"/>
+          <w:strike/>
         </w:rPr>
         <w:t>bộ.→</w:t>
       </w:r>
@@ -930,6 +939,7 @@
       <w:r>
         <w:rPr>
           <w:rFonts w:ascii="Times New Roman" w:hAnsi="Times New Roman" w:cs="Times New Roman"/>
+          <w:strike/>
         </w:rPr>
         <w:t xml:space="preserve"> CF 08–14 XtraForm</w:t>
       </w:r>
@@ -991,11 +1001,13 @@
         <w:spacing w:line="360" w:lineRule="auto"/>
         <w:rPr>
           <w:rFonts w:ascii="Times New Roman" w:hAnsi="Times New Roman" w:cs="Times New Roman"/>
-        </w:rPr>
-      </w:pPr>
-      <w:r>
-        <w:rPr>
-          <w:rFonts w:ascii="Times New Roman" w:hAnsi="Times New Roman" w:cs="Times New Roman"/>
+          <w:strike/>
+        </w:rPr>
+      </w:pPr>
+      <w:r>
+        <w:rPr>
+          <w:rFonts w:ascii="Times New Roman" w:hAnsi="Times New Roman" w:cs="Times New Roman"/>
+          <w:strike/>
         </w:rPr>
         <w:t xml:space="preserve">frmAdminPanel Trang quản trị — NavBar phân mục: Users · Hosts · Catalog · Coupon · Services · Reviews. Mỗi mục load 1 UC tương ứng vào panel </w:t>
       </w:r>
@@ -1003,6 +1015,7 @@
       <w:r>
         <w:rPr>
           <w:rFonts w:ascii="Times New Roman" w:hAnsi="Times New Roman" w:cs="Times New Roman"/>
+          <w:strike/>
         </w:rPr>
         <w:t>chính.→</w:t>
       </w:r>
@@ -1010,6 +1023,7 @@
       <w:r>
         <w:rPr>
           <w:rFonts w:ascii="Times New Roman" w:hAnsi="Times New Roman" w:cs="Times New Roman"/>
+          <w:strike/>
         </w:rPr>
         <w:t xml:space="preserve"> CF 06–07, 22–23, 27, 29, 31–34 XtraForm</w:t>
       </w:r>
@@ -1101,11 +1115,13 @@
         <w:spacing w:line="360" w:lineRule="auto"/>
         <w:rPr>
           <w:rFonts w:ascii="Times New Roman" w:hAnsi="Times New Roman" w:cs="Times New Roman"/>
-        </w:rPr>
-      </w:pPr>
-      <w:r>
-        <w:rPr>
-          <w:rFonts w:ascii="Times New Roman" w:hAnsi="Times New Roman" w:cs="Times New Roman"/>
+          <w:color w:val="EE0000"/>
+        </w:rPr>
+      </w:pPr>
+      <w:r>
+        <w:rPr>
+          <w:rFonts w:ascii="Times New Roman" w:hAnsi="Times New Roman" w:cs="Times New Roman"/>
+          <w:color w:val="EE0000"/>
         </w:rPr>
         <w:t>dlgBankAccount: Thêm / sửa tài khoản ngân hàng của Host → CF 04</w:t>
       </w:r>
@@ -1196,11 +1212,13 @@
         <w:spacing w:line="360" w:lineRule="auto"/>
         <w:rPr>
           <w:rFonts w:ascii="Times New Roman" w:hAnsi="Times New Roman" w:cs="Times New Roman"/>
-        </w:rPr>
-      </w:pPr>
-      <w:r>
-        <w:rPr>
-          <w:rFonts w:ascii="Times New Roman" w:hAnsi="Times New Roman" w:cs="Times New Roman"/>
+          <w:strike/>
+        </w:rPr>
+      </w:pPr>
+      <w:r>
+        <w:rPr>
+          <w:rFonts w:ascii="Times New Roman" w:hAnsi="Times New Roman" w:cs="Times New Roman"/>
+          <w:strike/>
         </w:rPr>
         <w:t>dlgItemPictures: Upload, xóa, sắp xếp thứ tự ảnh cho listing → CF 09</w:t>
       </w:r>
@@ -1272,11 +1290,13 @@
         <w:spacing w:line="360" w:lineRule="auto"/>
         <w:rPr>
           <w:rFonts w:ascii="Times New Roman" w:hAnsi="Times New Roman" w:cs="Times New Roman"/>
-        </w:rPr>
-      </w:pPr>
-      <w:r>
-        <w:rPr>
-          <w:rFonts w:ascii="Times New Roman" w:hAnsi="Times New Roman" w:cs="Times New Roman"/>
+          <w:strike/>
+        </w:rPr>
+      </w:pPr>
+      <w:r>
+        <w:rPr>
+          <w:rFonts w:ascii="Times New Roman" w:hAnsi="Times New Roman" w:cs="Times New Roman"/>
+          <w:strike/>
         </w:rPr>
         <w:t xml:space="preserve">ucOwnerListings: Danh sách listing của Host, </w:t>
       </w:r>
@@ -1284,6 +1304,7 @@
       <w:r>
         <w:rPr>
           <w:rFonts w:ascii="Times New Roman" w:hAnsi="Times New Roman" w:cs="Times New Roman"/>
+          <w:strike/>
         </w:rPr>
         <w:t>nút</w:t>
       </w:r>
@@ -1291,6 +1312,7 @@
       <w:r>
         <w:rPr>
           <w:rFonts w:ascii="Times New Roman" w:hAnsi="Times New Roman" w:cs="Times New Roman"/>
+          <w:strike/>
         </w:rPr>
         <w:t xml:space="preserve"> Add Listing, Edit Details, Delete</w:t>
       </w:r>
@@ -1400,11 +1422,13 @@
         <w:spacing w:line="360" w:lineRule="auto"/>
         <w:rPr>
           <w:rFonts w:ascii="Times New Roman" w:hAnsi="Times New Roman" w:cs="Times New Roman"/>
-        </w:rPr>
-      </w:pPr>
-      <w:r>
-        <w:rPr>
-          <w:rFonts w:ascii="Times New Roman" w:hAnsi="Times New Roman" w:cs="Times New Roman"/>
+          <w:strike/>
+        </w:rPr>
+      </w:pPr>
+      <w:r>
+        <w:rPr>
+          <w:rFonts w:ascii="Times New Roman" w:hAnsi="Times New Roman" w:cs="Times New Roman"/>
+          <w:strike/>
         </w:rPr>
         <w:t>ucMyProfile: Xem/sửa hồ sơ, loyalty points, tài khoản ngân hàng</w:t>
       </w:r>
@@ -1452,11 +1476,13 @@
         <w:spacing w:line="360" w:lineRule="auto"/>
         <w:rPr>
           <w:rFonts w:ascii="Times New Roman" w:hAnsi="Times New Roman" w:cs="Times New Roman"/>
-        </w:rPr>
-      </w:pPr>
-      <w:r>
-        <w:rPr>
-          <w:rFonts w:ascii="Times New Roman" w:hAnsi="Times New Roman" w:cs="Times New Roman"/>
+          <w:strike/>
+        </w:rPr>
+      </w:pPr>
+      <w:r>
+        <w:rPr>
+          <w:rFonts w:ascii="Times New Roman" w:hAnsi="Times New Roman" w:cs="Times New Roman"/>
+          <w:strike/>
         </w:rPr>
         <w:t>ucListingDetails: Tab 1 — Type, Title, Capacity, Beds, Address, Description, Host Rules, Min/Max nights</w:t>
       </w:r>
@@ -1471,11 +1497,13 @@
         <w:spacing w:line="360" w:lineRule="auto"/>
         <w:rPr>
           <w:rFonts w:ascii="Times New Roman" w:hAnsi="Times New Roman" w:cs="Times New Roman"/>
-        </w:rPr>
-      </w:pPr>
-      <w:r>
-        <w:rPr>
-          <w:rFonts w:ascii="Times New Roman" w:hAnsi="Times New Roman" w:cs="Times New Roman"/>
+          <w:strike/>
+        </w:rPr>
+      </w:pPr>
+      <w:r>
+        <w:rPr>
+          <w:rFonts w:ascii="Times New Roman" w:hAnsi="Times New Roman" w:cs="Times New Roman"/>
+          <w:strike/>
         </w:rPr>
         <w:t>ucListingAmenities: Tab 2 — CheckedListBox toàn bộ Amenities, tick để gắn</w:t>
       </w:r>
@@ -1490,11 +1518,13 @@
         <w:spacing w:line="360" w:lineRule="auto"/>
         <w:rPr>
           <w:rFonts w:ascii="Times New Roman" w:hAnsi="Times New Roman" w:cs="Times New Roman"/>
-        </w:rPr>
-      </w:pPr>
-      <w:r>
-        <w:rPr>
-          <w:rFonts w:ascii="Times New Roman" w:hAnsi="Times New Roman" w:cs="Times New Roman"/>
+          <w:strike/>
+        </w:rPr>
+      </w:pPr>
+      <w:r>
+        <w:rPr>
+          <w:rFonts w:ascii="Times New Roman" w:hAnsi="Times New Roman" w:cs="Times New Roman"/>
+          <w:strike/>
         </w:rPr>
         <w:t>ucListingAttractions: Tab 3 — Grid điểm du lịch + Distance/OnFoot/ByCar (tối thiểu 2)</w:t>
       </w:r>
@@ -1509,11 +1539,13 @@
         <w:spacing w:line="360" w:lineRule="auto"/>
         <w:rPr>
           <w:rFonts w:ascii="Times New Roman" w:hAnsi="Times New Roman" w:cs="Times New Roman"/>
-        </w:rPr>
-      </w:pPr>
-      <w:r>
-        <w:rPr>
-          <w:rFonts w:ascii="Times New Roman" w:hAnsi="Times New Roman" w:cs="Times New Roman"/>
+          <w:strike/>
+        </w:rPr>
+      </w:pPr>
+      <w:r>
+        <w:rPr>
+          <w:rFonts w:ascii="Times New Roman" w:hAnsi="Times New Roman" w:cs="Times New Roman"/>
+          <w:strike/>
         </w:rPr>
         <w:lastRenderedPageBreak/>
         <w:t>ucPricingCalendar: Calendar DevExpress chọn ngày, nhập giá + chính sách hủy theo ngày</w:t>
@@ -1529,11 +1561,13 @@
         <w:spacing w:line="360" w:lineRule="auto"/>
         <w:rPr>
           <w:rFonts w:ascii="Times New Roman" w:hAnsi="Times New Roman" w:cs="Times New Roman"/>
-        </w:rPr>
-      </w:pPr>
-      <w:r>
-        <w:rPr>
-          <w:rFonts w:ascii="Times New Roman" w:hAnsi="Times New Roman" w:cs="Times New Roman"/>
+          <w:strike/>
+        </w:rPr>
+      </w:pPr>
+      <w:r>
+        <w:rPr>
+          <w:rFonts w:ascii="Times New Roman" w:hAnsi="Times New Roman" w:cs="Times New Roman"/>
+          <w:strike/>
         </w:rPr>
         <w:t>ucAvailabilityCalendar: Calendar mở / đóng ngày available cho listing</w:t>
       </w:r>
@@ -1586,11 +1620,13 @@
         <w:spacing w:line="360" w:lineRule="auto"/>
         <w:rPr>
           <w:rFonts w:ascii="Times New Roman" w:hAnsi="Times New Roman" w:cs="Times New Roman"/>
-        </w:rPr>
-      </w:pPr>
-      <w:r>
-        <w:rPr>
-          <w:rFonts w:ascii="Times New Roman" w:hAnsi="Times New Roman" w:cs="Times New Roman"/>
+          <w:strike/>
+        </w:rPr>
+      </w:pPr>
+      <w:r>
+        <w:rPr>
+          <w:rFonts w:ascii="Times New Roman" w:hAnsi="Times New Roman" w:cs="Times New Roman"/>
+          <w:strike/>
         </w:rPr>
         <w:t>ucAdminUsers: CRUD toàn bộ Users, kích hoạt / khóa tài khoản</w:t>
       </w:r>
@@ -1605,11 +1641,13 @@
         <w:spacing w:line="360" w:lineRule="auto"/>
         <w:rPr>
           <w:rFonts w:ascii="Times New Roman" w:hAnsi="Times New Roman" w:cs="Times New Roman"/>
-        </w:rPr>
-      </w:pPr>
-      <w:r>
-        <w:rPr>
-          <w:rFonts w:ascii="Times New Roman" w:hAnsi="Times New Roman" w:cs="Times New Roman"/>
+          <w:strike/>
+        </w:rPr>
+      </w:pPr>
+      <w:r>
+        <w:rPr>
+          <w:rFonts w:ascii="Times New Roman" w:hAnsi="Times New Roman" w:cs="Times New Roman"/>
+          <w:strike/>
         </w:rPr>
         <w:t>ucAdminHosts: Duyệt host mới (IsVerified), xem hồ sơ, block host vi phạm</w:t>
       </w:r>
@@ -1624,11 +1662,13 @@
         <w:spacing w:line="360" w:lineRule="auto"/>
         <w:rPr>
           <w:rFonts w:ascii="Times New Roman" w:hAnsi="Times New Roman" w:cs="Times New Roman"/>
-        </w:rPr>
-      </w:pPr>
-      <w:r>
-        <w:rPr>
-          <w:rFonts w:ascii="Times New Roman" w:hAnsi="Times New Roman" w:cs="Times New Roman"/>
+          <w:strike/>
+        </w:rPr>
+      </w:pPr>
+      <w:r>
+        <w:rPr>
+          <w:rFonts w:ascii="Times New Roman" w:hAnsi="Times New Roman" w:cs="Times New Roman"/>
+          <w:strike/>
         </w:rPr>
         <w:t>ucAdminAreas: CRUD bảng Areas (quận / khu vực)</w:t>
       </w:r>
@@ -1643,11 +1683,13 @@
         <w:spacing w:line="360" w:lineRule="auto"/>
         <w:rPr>
           <w:rFonts w:ascii="Times New Roman" w:hAnsi="Times New Roman" w:cs="Times New Roman"/>
-        </w:rPr>
-      </w:pPr>
-      <w:r>
-        <w:rPr>
-          <w:rFonts w:ascii="Times New Roman" w:hAnsi="Times New Roman" w:cs="Times New Roman"/>
+          <w:strike/>
+        </w:rPr>
+      </w:pPr>
+      <w:r>
+        <w:rPr>
+          <w:rFonts w:ascii="Times New Roman" w:hAnsi="Times New Roman" w:cs="Times New Roman"/>
+          <w:strike/>
         </w:rPr>
         <w:t>ucAdminAttractions: CRUD bảng Attractions, gắn AreaID</w:t>
       </w:r>
@@ -1662,23 +1704,27 @@
         <w:spacing w:line="360" w:lineRule="auto"/>
         <w:rPr>
           <w:rFonts w:ascii="Times New Roman" w:hAnsi="Times New Roman" w:cs="Times New Roman"/>
-        </w:rPr>
-      </w:pPr>
-      <w:r>
-        <w:rPr>
-          <w:rFonts w:ascii="Times New Roman" w:hAnsi="Times New Roman" w:cs="Times New Roman"/>
+          <w:strike/>
+        </w:rPr>
+      </w:pPr>
+      <w:r>
+        <w:rPr>
+          <w:rFonts w:ascii="Times New Roman" w:hAnsi="Times New Roman" w:cs="Times New Roman"/>
+          <w:strike/>
         </w:rPr>
         <w:t>ucAdminAmenities:</w:t>
       </w:r>
       <w:r>
         <w:rPr>
           <w:rFonts w:ascii="Times New Roman" w:hAnsi="Times New Roman" w:cs="Times New Roman"/>
+          <w:strike/>
         </w:rPr>
         <w:t xml:space="preserve"> </w:t>
       </w:r>
       <w:r>
         <w:rPr>
           <w:rFonts w:ascii="Times New Roman" w:hAnsi="Times New Roman" w:cs="Times New Roman"/>
+          <w:strike/>
         </w:rPr>
         <w:t>CRUD Amenities (tên, icon)</w:t>
       </w:r>
@@ -1693,11 +1739,13 @@
         <w:spacing w:line="360" w:lineRule="auto"/>
         <w:rPr>
           <w:rFonts w:ascii="Times New Roman" w:hAnsi="Times New Roman" w:cs="Times New Roman"/>
-        </w:rPr>
-      </w:pPr>
-      <w:r>
-        <w:rPr>
-          <w:rFonts w:ascii="Times New Roman" w:hAnsi="Times New Roman" w:cs="Times New Roman"/>
+          <w:strike/>
+        </w:rPr>
+      </w:pPr>
+      <w:r>
+        <w:rPr>
+          <w:rFonts w:ascii="Times New Roman" w:hAnsi="Times New Roman" w:cs="Times New Roman"/>
+          <w:strike/>
         </w:rPr>
         <w:t>ucAdminItemTypes: CRUD ItemTypes + TransactionTypes</w:t>
       </w:r>
@@ -1712,11 +1760,13 @@
         <w:spacing w:line="360" w:lineRule="auto"/>
         <w:rPr>
           <w:rFonts w:ascii="Times New Roman" w:hAnsi="Times New Roman" w:cs="Times New Roman"/>
-        </w:rPr>
-      </w:pPr>
-      <w:r>
-        <w:rPr>
-          <w:rFonts w:ascii="Times New Roman" w:hAnsi="Times New Roman" w:cs="Times New Roman"/>
+          <w:strike/>
+        </w:rPr>
+      </w:pPr>
+      <w:r>
+        <w:rPr>
+          <w:rFonts w:ascii="Times New Roman" w:hAnsi="Times New Roman" w:cs="Times New Roman"/>
+          <w:strike/>
         </w:rPr>
         <w:t>ucAdminCoupons: CRUD Coupons — mã, %, ngày hết hạn, giới hạn dùng</w:t>
       </w:r>
@@ -1731,23 +1781,27 @@
         <w:spacing w:line="360" w:lineRule="auto"/>
         <w:rPr>
           <w:rFonts w:ascii="Times New Roman" w:hAnsi="Times New Roman" w:cs="Times New Roman"/>
-        </w:rPr>
-      </w:pPr>
-      <w:r>
-        <w:rPr>
-          <w:rFonts w:ascii="Times New Roman" w:hAnsi="Times New Roman" w:cs="Times New Roman"/>
+          <w:strike/>
+        </w:rPr>
+      </w:pPr>
+      <w:r>
+        <w:rPr>
+          <w:rFonts w:ascii="Times New Roman" w:hAnsi="Times New Roman" w:cs="Times New Roman"/>
+          <w:strike/>
         </w:rPr>
         <w:t>ucAdminServices:</w:t>
       </w:r>
       <w:r>
         <w:rPr>
           <w:rFonts w:ascii="Times New Roman" w:hAnsi="Times New Roman" w:cs="Times New Roman"/>
+          <w:strike/>
         </w:rPr>
         <w:t xml:space="preserve"> </w:t>
       </w:r>
       <w:r>
         <w:rPr>
           <w:rFonts w:ascii="Times New Roman" w:hAnsi="Times New Roman" w:cs="Times New Roman"/>
+          <w:strike/>
         </w:rPr>
         <w:t>CRUD ServiceTypes + Services (giá, capacity, lịch)</w:t>
       </w:r>
@@ -7522,7 +7576,7 @@
           <w:rFonts w:ascii="Times New Roman" w:hAnsi="Times New Roman" w:cs="Times New Roman"/>
         </w:rPr>
         <w:pict w14:anchorId="5A530C79">
-          <v:rect id="_x0000_i1049" style="width:0;height:.75pt" o:hralign="center" o:hrstd="t" o:hr="t" fillcolor="#a0a0a0" stroked="f"/>
+          <v:rect id="_x0000_i1025" style="width:0;height:.75pt" o:hralign="center" o:hrstd="t" o:hr="t" fillcolor="#a0a0a0" stroked="f"/>
         </w:pict>
       </w:r>
     </w:p>
@@ -7804,7 +7858,7 @@
           <w:rFonts w:ascii="Times New Roman" w:hAnsi="Times New Roman" w:cs="Times New Roman"/>
         </w:rPr>
         <w:pict w14:anchorId="3F1251CD">
-          <v:rect id="_x0000_i1050" style="width:0;height:.75pt" o:hralign="center" o:hrstd="t" o:hr="t" fillcolor="#a0a0a0" stroked="f"/>
+          <v:rect id="_x0000_i1026" style="width:0;height:.75pt" o:hralign="center" o:hrstd="t" o:hr="t" fillcolor="#a0a0a0" stroked="f"/>
         </w:pict>
       </w:r>
     </w:p>
@@ -8054,7 +8108,7 @@
           <w:rFonts w:ascii="Times New Roman" w:hAnsi="Times New Roman" w:cs="Times New Roman"/>
         </w:rPr>
         <w:pict w14:anchorId="3CD90921">
-          <v:rect id="_x0000_i1051" style="width:0;height:.75pt" o:hralign="center" o:hrstd="t" o:hr="t" fillcolor="#a0a0a0" stroked="f"/>
+          <v:rect id="_x0000_i1027" style="width:0;height:.75pt" o:hralign="center" o:hrstd="t" o:hr="t" fillcolor="#a0a0a0" stroked="f"/>
         </w:pict>
       </w:r>
     </w:p>
@@ -8337,7 +8391,7 @@
           <w:rFonts w:ascii="Times New Roman" w:hAnsi="Times New Roman" w:cs="Times New Roman"/>
         </w:rPr>
         <w:pict w14:anchorId="6D4000CA">
-          <v:rect id="_x0000_i1052" style="width:0;height:.75pt" o:hralign="center" o:hrstd="t" o:hr="t" fillcolor="#a0a0a0" stroked="f"/>
+          <v:rect id="_x0000_i1028" style="width:0;height:.75pt" o:hralign="center" o:hrstd="t" o:hr="t" fillcolor="#a0a0a0" stroked="f"/>
         </w:pict>
       </w:r>
     </w:p>
@@ -10510,6 +10564,7 @@
   <w:style w:type="character" w:default="1" w:styleId="DefaultParagraphFont">
     <w:name w:val="Default Paragraph Font"/>
     <w:uiPriority w:val="1"/>
+    <w:semiHidden/>
     <w:unhideWhenUsed/>
   </w:style>
   <w:style w:type="table" w:default="1" w:styleId="TableNormal">

</xml_diff>